<commit_message>
Regenerate script 2/3 PDF and Word exports from current text
Also fixes a duration-line sizing bug shared by both export scripts:
the meta-style flag was cleared after every block instead of only
after the first paragraph, so the "duration" line under the title
rendered at full body size instead of script 1's smaller/gray style.

Co-Authored-By: Claude Sonnet 5 <noreply@anthropic.com>
</commit_message>
<xml_diff>
--- a/2_bayes_vs_ols_tips/script_2_bayes_vs_ols.docx
+++ b/2_bayes_vs_ols_tips/script_2_bayes_vs_ols.docx
@@ -4,32 +4,30 @@
   <w:body>
     <w:p>
       <w:pPr>
-        <w:bidi/>
         <w:spacing w:after="80" w:before="0"/>
         <w:jc w:val="center"/>
+        <w:bidi/>
       </w:pPr>
       <w:r>
         <w:rPr>
           <w:rFonts w:ascii="David" w:hAnsi="David" w:cs="David" w:eastAsia="David"/>
           <w:b/>
-          <w:i w:val="0"/>
           <w:sz w:val="36"/>
           <w:rtl/>
         </w:rPr>
-        <w:t>תסריט להקלטה למחברת 2: בייסאני מול OLS/MixedLM/ANOVA, טיפים במסעדה</w:t>
+        <w:t>תסריט להקלטה למחברת 2: בייסאני מול OLS/ANOVA, טיפים במסעדה</w:t>
       </w:r>
     </w:p>
     <w:p>
       <w:pPr>
+        <w:spacing w:after="280"/>
+        <w:jc w:val="center"/>
         <w:bidi/>
-        <w:spacing w:after="280" w:before="0"/>
-        <w:jc w:val="center"/>
       </w:pPr>
       <w:r>
         <w:rPr>
           <w:rFonts w:ascii="David" w:hAnsi="David" w:cs="David" w:eastAsia="David"/>
           <w:b w:val="0"/>
-          <w:i w:val="0"/>
           <w:sz w:val="21"/>
           <w:rtl/>
         </w:rPr>
@@ -38,15 +36,14 @@
     </w:p>
     <w:p>
       <w:pPr>
+        <w:spacing w:before="360" w:after="160"/>
+        <w:jc w:val="right"/>
         <w:bidi/>
-        <w:spacing w:after="160" w:before="360"/>
-        <w:jc w:val="right"/>
       </w:pPr>
       <w:r>
         <w:rPr>
           <w:rFonts w:ascii="David" w:hAnsi="David" w:cs="David" w:eastAsia="David"/>
           <w:b/>
-          <w:i w:val="0"/>
           <w:sz w:val="29"/>
           <w:rtl/>
         </w:rPr>
@@ -55,49 +52,30 @@
     </w:p>
     <w:p>
       <w:pPr>
+        <w:spacing w:after="160"/>
+        <w:jc w:val="both"/>
         <w:bidi/>
-        <w:spacing w:after="160" w:before="0"/>
-        <w:jc w:val="both"/>
       </w:pPr>
       <w:r>
         <w:rPr>
           <w:rFonts w:ascii="David" w:hAnsi="David" w:cs="David" w:eastAsia="David"/>
           <w:b w:val="0"/>
-          <w:i w:val="0"/>
           <w:sz w:val="25"/>
           <w:rtl/>
         </w:rPr>
-        <w:t>במחברת הזאת אני משווה רגרסיה, פעם בגישה הבייסאנית ופעם בגישה הקלאסית, כדי לבדוק שאלה אחת: האם סכום החשבון במסעדה מנבא את גובה הטיפ, והאם הקשר הזה שונה בין ימות השבוע. הדאטה הוא מאגר אמיתי של 244 חשבונות מסעדה, מובנה בתוך ספריית seaborn. אני משתמשת בכמה מקבילות קלאסיות שונות לאורך המחברת: מול המודל הפשוט אני משווה לרגרסיית OLS רגילה, מול השאלה של הבדלים בין ימים אני משווה גם למבחני ANOVA וגם למודל אפקטים מעורבים שנקרא MixedLM, שהוא הגרסה הקלאסית למודל היררכי.</w:t>
+        <w:t>במחברת הזאת אני משווה רגרסיה, פעם בגישה הבייסאנית ופעם בגישה הקלאסית, כדי לבדוק שאלה אחת: האם סכום החשבון במסעדה מנבא את גובה הטיפ, והאם הקשר הזה שונה בין ימות השבוע. הדאטה הוא מאגר אמיתי של 244 חשבונות מסעדה, מובנה בתוך ספריית seaborn. אני משתמשת בכמה מקבילות קלאסיות שונות לאורך המחברת: מול המודל הפשוט אני משווה לרגרסיית OLS רגילה, מול השאלה של הבדלים בין ימים אני משווה גם למבחני ANOVA וגם לקרוסקל-וואליס, ובהמשך, כשבודקת כיווץ מול המודל ההיררכי הבייסאני, אני משווה לרגרסיית OLS נפרדת לכל יום בלי שום שיתוף מידע ביניהם.</w:t>
       </w:r>
     </w:p>
     <w:p>
       <w:pPr>
+        <w:spacing w:before="360" w:after="160"/>
+        <w:jc w:val="right"/>
         <w:bidi/>
-        <w:spacing w:after="160" w:before="0"/>
-        <w:jc w:val="both"/>
-      </w:pPr>
-      <w:r>
-        <w:rPr>
-          <w:rFonts w:ascii="David" w:hAnsi="David" w:cs="David" w:eastAsia="David"/>
-          <w:b w:val="0"/>
-          <w:i w:val="0"/>
-          <w:sz w:val="25"/>
-          <w:rtl/>
-        </w:rPr>
-        <w:t>לצד הספריות הרגילות, נטען כאן גם המודול שמאפשר להריץ MixedLM.</w:t>
-      </w:r>
-    </w:p>
-    <w:p>
-      <w:pPr>
-        <w:bidi/>
-        <w:spacing w:after="160" w:before="360"/>
-        <w:jc w:val="right"/>
       </w:pPr>
       <w:r>
         <w:rPr>
           <w:rFonts w:ascii="David" w:hAnsi="David" w:cs="David" w:eastAsia="David"/>
           <w:b/>
-          <w:i w:val="0"/>
           <w:sz w:val="29"/>
           <w:rtl/>
         </w:rPr>
@@ -106,99 +84,62 @@
     </w:p>
     <w:p>
       <w:pPr>
+        <w:spacing w:after="160"/>
+        <w:jc w:val="both"/>
         <w:bidi/>
-        <w:spacing w:after="160" w:before="0"/>
-        <w:jc w:val="both"/>
       </w:pPr>
       <w:r>
         <w:rPr>
           <w:rFonts w:ascii="David" w:hAnsi="David" w:cs="David" w:eastAsia="David"/>
           <w:b w:val="0"/>
-          <w:i w:val="0"/>
           <w:sz w:val="25"/>
           <w:rtl/>
         </w:rPr>
-        <w:t>לפני שממשיכים לבניית מודלים, בואו נסתכל רגע על הדאטה עצמו. עוד לפני הגרפים, יש טבלת describe מפורקת לפי יום: לכל אחד מארבעת הימים כמות התצפיות, ממוצע, סטיית תקן, מינימום, מקסימום ואחוזונים, גם של סכום החשבון וגם של הטיפ. כבר כאן רואים נקודה שתחזור לאורך כל המחברת: ליום שישי יש רק תשע-עשרה תצפיות, הרבה פחות מהימים האחרים (בין שישים לשמונים-ושבע), מה שיהפוך אותו לקבוצה הכי רועשת ולזאת שכיווץ ישפיע עליה הכי הרבה בהמשך.</w:t>
+        <w:t>לפני שממשיכים לבניית מודלים, בואו נסתכל רגע על הדאטה עצמו. עוד לפני הגרפים, אני משתמשת בפונקציית describe של פנדס, מפורקת לפי יום, כך שלכל אחד מארבעת הימים מופיעים כמות התצפיות, ממוצע, סטיית תקן, מינימום, מקסימום ואחוזונים, גם של סכום החשבון וגם של הטיפ. אתם יכולים לראות למשל שליום שישי יש רק תשע-עשרה תצפיות שזה הרבה פחות מהימים האחרים שלהם יש בין שישים לשמונים-ושבע תצפיות.</w:t>
       </w:r>
     </w:p>
     <w:p>
       <w:pPr>
+        <w:spacing w:after="160"/>
+        <w:jc w:val="both"/>
         <w:bidi/>
-        <w:spacing w:after="160" w:before="0"/>
-        <w:jc w:val="both"/>
       </w:pPr>
       <w:r>
         <w:rPr>
           <w:rFonts w:ascii="David" w:hAnsi="David" w:cs="David" w:eastAsia="David"/>
           <w:b w:val="0"/>
-          <w:i w:val="0"/>
           <w:sz w:val="25"/>
           <w:rtl/>
         </w:rPr>
-        <w:t>גרף הפיזור הזה: סכום החשבון על ציר ה-X, גובה הטיפ על ציר ה-Y, כל יום בשבוע בצבע אחר עם קו רגרסיה משלו, ומעליהם קו שחור מקווקו שמייצג רגרסיה אחת מאוחדת על כל הימים ביחד. הרעיון הוא לבדוק חזותית אם קווי הרגרסיה הצבעוניים, כל יום בנפרד, הולכים לכיוון שונה מהקו השחור המאוחד. שאלתי את הצ'אט על תופעה שהתמונה הזאת מזכירה:</w:t>
+        <w:t>כדי לבדוק חזותית אם קווי הרגרסיה, כל יום בנפרד, הולכים לכיוון שונה מהרגרסיה המאוחדת על כל הימים ביחד, אני בונה את הגרף הזה עם lmplot של seaborn, שמצייר אוטומטית קו רגרסיה נפרד לכל יום בשבוע, כל אחד בצבע משלו. סכום החשבון מופיע על ציר ה-X וגובה הטיפ על ציר ה-Y, ומעליהם קו שחור מקווקו שמייצג את הרגרסיה המאוחדת. ואכן אפשר לראות שקווי הרגרסיה הצבעוניים לא לגמרי מקבילים לקו השחור, בעיקר בשיפוע שלהם.</w:t>
       </w:r>
     </w:p>
     <w:p>
       <w:pPr>
-        <w:spacing w:after="160" w:before="80"/>
-        <w:jc w:val="left"/>
-        <w:shd w:val="clear" w:fill="EEF3FB"/>
-      </w:pPr>
-      <w:r>
-        <w:rPr>
-          <w:rFonts w:ascii="Segoe UI" w:hAnsi="Segoe UI" w:cs="Segoe UI" w:eastAsia="Segoe UI"/>
-          <w:b/>
-          <w:i w:val="0"/>
-          <w:sz w:val="24"/>
-        </w:rPr>
-        <w:t>Chat, what is Simpson's paradox in one sentence, and how do you deal with it in another? Does it show up in this restaurant-tips data?</w:t>
-      </w:r>
-    </w:p>
-    <w:p>
-      <w:pPr>
+        <w:spacing w:after="160"/>
+        <w:jc w:val="both"/>
         <w:bidi/>
-        <w:spacing w:after="160" w:before="0"/>
-        <w:jc w:val="both"/>
       </w:pPr>
       <w:r>
         <w:rPr>
           <w:rFonts w:ascii="David" w:hAnsi="David" w:cs="David" w:eastAsia="David"/>
           <w:b w:val="0"/>
-          <w:i w:val="0"/>
           <w:sz w:val="25"/>
           <w:rtl/>
         </w:rPr>
-        <w:t>והוא ענה שזה מצב שבו מגמה שמתקיימת בתוך כל תת-קבוצה בנפרד יכולה להתהפך או להיעלם לגמרי ברגע שמאחדים את כל התת-הקבוצות יחד, והדרך להתמודד איתה היא תמיד לבדוק את הקשר בתוך הקבוצות הטבעיות לפני שסומכים על הגרסה המאוחדת. זה בדיוק מה שמצדיק בהמשך לבנות מודל שמתייחס לכל יום בנפרד, במקום רגרסיה אחת גורפת.</w:t>
+        <w:t>לא הסתפקתי ברושם החזותי הזה, ובדקתי גם באופן מספרי אם יש כאן באמת פרדוקס סימפסון: עם פונקציית polyfit של numpy חישבתי את השיפוע של קו הרגרסיה בנפרד לכל יום, ואת השיפוע של הרגרסיה המאוחדת. כל ארבעת הימים יצאו עם שיפוע חיובי, וגם השיפוע המאוחד יצא חיובי, כך שאין כאן היפוך סימן מלא, וזו לא דוגמה טהורה לפרדוקס סימפסון כמו המקרים הקלאסיים שבהם מגמה שלמה מתהפכת. מה שכן יש הוא הבדל אמיתי בגודל השיפוע בין הימים, כ-0.07 ביום ראשון ועד מעל 0.12 בחמישי, וזו גרסה מתונה יותר של אותה בעיה בדיוק: רגרסיה מאוחדת אחת מטשטשת התנהגות שבפועל שונה בין ימים.</w:t>
       </w:r>
     </w:p>
     <w:p>
       <w:pPr>
+        <w:spacing w:before="360" w:after="160"/>
+        <w:jc w:val="right"/>
         <w:bidi/>
-        <w:spacing w:after="160" w:before="0"/>
-        <w:jc w:val="both"/>
-      </w:pPr>
-      <w:r>
-        <w:rPr>
-          <w:rFonts w:ascii="David" w:hAnsi="David" w:cs="David" w:eastAsia="David"/>
-          <w:b w:val="0"/>
-          <w:i w:val="0"/>
-          <w:sz w:val="25"/>
-          <w:rtl/>
-        </w:rPr>
-        <w:t>לא הסתפקתי בהגדרה המילולית ובדקתי אם זה בכלל קיים בדאטה שלי: חישבתי את השיפוע של קו הרגרסיה בנפרד לכל יום, ואת השיפוע של הרגרסיה המאוחדת. כל ארבעת הימים יצאו עם שיפוע חיובי, וגם השיפוע המאוחד יצא חיובי, כך שאין כאן היפוך סימן מלא, וזו לא דוגמה טהורה לפרדוקס סימפסון כמו המקרים הקלאסיים שבהם מגמה שלמה מתהפכת. מה שכן יש הוא הבדל אמיתי בגודל השיפוע בין הימים, מתחת ל-0.07 ביום ראשון ועד מעל 0.12 בחמישי, וזו גרסה מתונה יותר של אותה בעיה בדיוק: רגרסיה מאוחדת אחת מטשטשת התנהגות שבפועל שונה בין ימים.</w:t>
-      </w:r>
-    </w:p>
-    <w:p>
-      <w:pPr>
-        <w:bidi/>
-        <w:spacing w:after="160" w:before="360"/>
-        <w:jc w:val="right"/>
       </w:pPr>
       <w:r>
         <w:rPr>
           <w:rFonts w:ascii="David" w:hAnsi="David" w:cs="David" w:eastAsia="David"/>
           <w:b/>
-          <w:i w:val="0"/>
           <w:sz w:val="29"/>
           <w:rtl/>
         </w:rPr>
@@ -207,24 +148,23 @@
     </w:p>
     <w:p>
       <w:pPr>
+        <w:spacing w:after="160"/>
+        <w:jc w:val="both"/>
         <w:bidi/>
-        <w:spacing w:after="160" w:before="0"/>
-        <w:jc w:val="both"/>
       </w:pPr>
       <w:r>
         <w:rPr>
           <w:rFonts w:ascii="David" w:hAnsi="David" w:cs="David" w:eastAsia="David"/>
           <w:b w:val="0"/>
-          <w:i w:val="0"/>
           <w:sz w:val="25"/>
           <w:rtl/>
         </w:rPr>
-        <w:t>המודל שאני בודקת כאן פשוט: הטיפ שווה חיתוך, ועוד שיפוע כפול סכום החשבון, ועוד רעש נורמלי אקראי. אפשר לכתוב את זה בשתי צורות שקולות לגמרי: הטיפ שווה לחיתוך ועוד שיפוע כפול סכום החשבון, ועוד רעש נורמלי בממוצע אפס; או, באופן שקול, הטיפ עצמו מתפלג נורמלית סביב חיתוך ועוד שיפוע כפול סכום החשבון. הצורה השנייה היא זו שממופה ישירות לקוד ה-PyMC בעוד רגע, שם כותבים ישירות "הטיפ מתפלג נורמלית עם ממוצע כזה וסטיית תקן כזאת". קודם, הגרסה הקלאסית: רגרסיית OLS. שאלתי את הצ'אט מה חשוב לבדוק בפלט הזה:</w:t>
+        <w:t>ברגרסיה הרגילה יוצאים מנקודת הנחה שהקשר בין גובה הטיפ לסכום החשבון הוא קו ישר, בתוספת איזשהו מקדם שגיאה. המודל שאני בודקת כאן פשוט: הטיפ שווה חיתוך, ועוד שיפוע כפול סכום החשבון, ועוד רעש נורמלי אקראי. באופן שקול אפשר לכתוב שהטיפ עצמו מתפלג נורמלית סביב חיתוך ועוד שיפוע כפול סכום החשבון, וזו הצורה שנראה עוד רגע בקוד ה-PyMC. נתחיל בגרסה הקלאסית: רגרסיית OLS, שאני מריצה עם sm.OLS של סטטסמודלס. שאלתי את הצ'אט מה חשוב לבדוק בפלט הזה:</w:t>
       </w:r>
     </w:p>
     <w:p>
       <w:pPr>
-        <w:spacing w:after="160" w:before="80"/>
+        <w:spacing w:before="80" w:after="160"/>
         <w:jc w:val="left"/>
         <w:shd w:val="clear" w:fill="EEF3FB"/>
       </w:pPr>
@@ -232,57 +172,53 @@
         <w:rPr>
           <w:rFonts w:ascii="Segoe UI" w:hAnsi="Segoe UI" w:cs="Segoe UI" w:eastAsia="Segoe UI"/>
           <w:b/>
-          <w:i w:val="0"/>
           <w:sz w:val="24"/>
         </w:rPr>
-        <w:t>Chat, what should I look for in this statsmodels OLS output, and what are OLS's assumptions?</w:t>
+        <w:t>Chat, what should I look for in this statsmodels OLS output?</w:t>
       </w:r>
     </w:p>
     <w:p>
       <w:pPr>
+        <w:spacing w:after="160"/>
+        <w:jc w:val="both"/>
         <w:bidi/>
-        <w:spacing w:after="160" w:before="0"/>
-        <w:jc w:val="both"/>
       </w:pPr>
       <w:r>
         <w:rPr>
           <w:rFonts w:ascii="David" w:hAnsi="David" w:cs="David" w:eastAsia="David"/>
           <w:b w:val="0"/>
-          <w:i w:val="0"/>
           <w:sz w:val="25"/>
           <w:rtl/>
         </w:rPr>
-        <w:t>והוא ענה שקודם מסתכלים על מקדם סכום החשבון, שאומר כמה כל דולר נוסף בחשבון מוסיף בממוצע לטיפ, עם ערך מובהקות זעיר שאומר שהקשר בטוח לא אפס במקרה. ה-R-squared אומר כמה אחוז מהשונות בטיפ מוסבר על ידי המשתנה הזה לבדו. הנחות OLS: קשר לינארי, שגיאות בלתי-תלויות, שונות קבועה של השגיאות לאורך כל טווח הערכים, ונורמליות של השגיאות, שחשובה בעיקר למדגמים קטנים כדי שהמבחנים הסטטיסטיים יהיו מדויקים.</w:t>
+        <w:t>והוא ענה שכדאי להסתכל קודם כול על מקדם סכום החשבון, שאומר כמה כל דולר נוסף בחשבון מוסיף בממוצע לטיפ, ולצדו על ערך המובהקות שלו, שבודק אם קשר בגודל כזה יכול לנבוע סתם ממקריות. בנוסף כדאי להסתכל על ה-R-squared, שאומר כמה אחוז מהשונות בטיפ מוסבר על ידי המשתנה הזה לבדו.</w:t>
       </w:r>
     </w:p>
     <w:p>
       <w:pPr>
+        <w:spacing w:after="160"/>
+        <w:jc w:val="both"/>
         <w:bidi/>
-        <w:spacing w:after="160" w:before="0"/>
-        <w:jc w:val="both"/>
       </w:pPr>
       <w:r>
         <w:rPr>
           <w:rFonts w:ascii="David" w:hAnsi="David" w:cs="David" w:eastAsia="David"/>
           <w:b w:val="0"/>
-          <w:i w:val="0"/>
           <w:sz w:val="25"/>
           <w:rtl/>
         </w:rPr>
-        <w:t>הפלט הוא טבלה שלמה, וכדאי לעבור עליה שורה-שורה כי היא תחזור שוב בהמשך הקורס. ערך ה-R-squared יצא כמעט 46 אחוז, מה שאומר שסכום החשבון לבדו מסביר קרוב למחצית מהשינוי בטיפ, לא הכל, הגיוני, כי טיפ תלוי גם בשירות, בגודל הקבוצה ובמצב הרוח. סטטיסטי F, יחד עם ההסתברות הזעירה שלו, בודק האם המודל כולו משפר את החיזוי בצורה מובהקת לעומת לא להשתמש בשום משתנה, וכאן התשובה ברורה וחד-משמעית.</w:t>
+        <w:t>הפלט הוא טבלה שלמה, וכדאי לעבור עליה שורה-שורה. ערך ה-R-squared יצא כמעט 46 אחוז, מה שאומר שסכום החשבון לבדו מסביר קרוב למחצית מהשינוי בטיפ, לא הכל, הגיוני, כי טיפ תלוי גם בשירות, בגודל הקבוצה ובמצב הרוח. סטטיסטי F, יחד עם ההסתברות הזעירה שלו, בודק האם המודל כולו משפר את החיזוי בצורה מובהקת לעומת לא להשתמש בשום משתנה, וכאן התשובה ברורה וחד-משמעית.</w:t>
       </w:r>
     </w:p>
     <w:p>
       <w:pPr>
+        <w:spacing w:after="160"/>
+        <w:jc w:val="both"/>
         <w:bidi/>
-        <w:spacing w:after="160" w:before="0"/>
-        <w:jc w:val="both"/>
       </w:pPr>
       <w:r>
         <w:rPr>
           <w:rFonts w:ascii="David" w:hAnsi="David" w:cs="David" w:eastAsia="David"/>
           <w:b w:val="0"/>
-          <w:i w:val="0"/>
           <w:sz w:val="25"/>
           <w:rtl/>
         </w:rPr>
@@ -291,24 +227,55 @@
     </w:p>
     <w:p>
       <w:pPr>
+        <w:spacing w:after="160"/>
+        <w:jc w:val="both"/>
         <w:bidi/>
-        <w:spacing w:after="160" w:before="0"/>
-        <w:jc w:val="both"/>
       </w:pPr>
       <w:r>
         <w:rPr>
           <w:rFonts w:ascii="David" w:hAnsi="David" w:cs="David" w:eastAsia="David"/>
           <w:b w:val="0"/>
-          <w:i w:val="0"/>
           <w:sz w:val="25"/>
           <w:rtl/>
         </w:rPr>
-        <w:t>לפני שאני בכלל בודקת את הנחות OLS בפועל, שאלתי את הצ'אט למה לשים לב בגרפי השאריות:</w:t>
+        <w:t>כדאי לבדוק את הנחות OLS בפועל ולא רק להניח שהן מתקיימות, ולכן אני מדפיסה, בעזרת subplots של matplotlib, שלושה גרפי שאריות זה לצד זה. הראשון הוא שאריות המודל מול הערכים המנובאים: פיזור כזה אמור להיראות כמו ענן חסר צורה סביב האפס, וכל עקמומיות נראית לעין, צורת משפך, או מגמה, מסמנת הפרת הנחה. השני הוא היסטוגרמה של השאריות, שמראה את צורת ההתפלגות שלהן. השלישי הוא תרשים Q-Q, שמשווה את האחוזונים של השאריות לאחוזונים שהיו מתקבלים מהתפלגות נורמלית מושלמת: נקודות שנצמדות לקו האלכסוני אומרות שהשאריות נראות נורמליות, ועקמומיות שיטתית ממנו, בעיקר בקצוות, אומרת שהן לא.</w:t>
       </w:r>
     </w:p>
     <w:p>
       <w:pPr>
-        <w:spacing w:after="160" w:before="80"/>
+        <w:spacing w:after="160"/>
+        <w:jc w:val="both"/>
+        <w:bidi/>
+      </w:pPr>
+      <w:r>
+        <w:rPr>
+          <w:rFonts w:ascii="David" w:hAnsi="David" w:cs="David" w:eastAsia="David"/>
+          <w:b w:val="0"/>
+          <w:sz w:val="25"/>
+          <w:rtl/>
+        </w:rPr>
+        <w:t>בפועל, הענן בגרף הראשון מראה נטייה קלה ימינה, ותרשים ה-Q-Q מתעקל בקצה העליון שלו, ושני הסימנים האלה מצביעים על אותה הפרה: השאריות לא באמת נורמליות. כדי לקבל על זה תוצאה פורמלית ולא רק רושם חזותי, הרצתי גם מבחן שפירו-וילק, עם פונקציית shapiro של scipy, שבודק ישירות אם סביר שמדגם נתון הגיע מהתפלגות נורמלית. המבחן יצא עם ערך מובהקות זעיר, כלומר דוחה את ההנחה שהשאריות מתפלגות נורמלית, בדיוק מה שהגרפים כבר רמזו עליו.</w:t>
+      </w:r>
+    </w:p>
+    <w:p>
+      <w:pPr>
+        <w:spacing w:after="160"/>
+        <w:jc w:val="both"/>
+        <w:bidi/>
+      </w:pPr>
+      <w:r>
+        <w:rPr>
+          <w:rFonts w:ascii="David" w:hAnsi="David" w:cs="David" w:eastAsia="David"/>
+          <w:b w:val="0"/>
+          <w:sz w:val="25"/>
+          <w:rtl/>
+        </w:rPr>
+        <w:t>שאלתי את הצ'אט מה המשמעות המעשית של זה:</w:t>
+      </w:r>
+    </w:p>
+    <w:p>
+      <w:pPr>
+        <w:spacing w:before="80" w:after="160"/>
         <w:jc w:val="left"/>
         <w:shd w:val="clear" w:fill="EEF3FB"/>
       </w:pPr>
@@ -316,49 +283,46 @@
         <w:rPr>
           <w:rFonts w:ascii="Segoe UI" w:hAnsi="Segoe UI" w:cs="Segoe UI" w:eastAsia="Segoe UI"/>
           <w:b/>
-          <w:i w:val="0"/>
           <w:sz w:val="24"/>
         </w:rPr>
-        <w:t>Chat, what should I look for in residual plots, and are the residuals here actually normal?</w:t>
+        <w:t>Chat, in practice, what does it mean that the residuals here fail the Shapiro-Wilk normality test, and does it invalidate the regression?</w:t>
       </w:r>
     </w:p>
     <w:p>
       <w:pPr>
+        <w:spacing w:after="160"/>
+        <w:jc w:val="both"/>
         <w:bidi/>
-        <w:spacing w:after="160" w:before="0"/>
-        <w:jc w:val="both"/>
       </w:pPr>
       <w:r>
         <w:rPr>
           <w:rFonts w:ascii="David" w:hAnsi="David" w:cs="David" w:eastAsia="David"/>
           <w:b w:val="0"/>
-          <w:i w:val="0"/>
           <w:sz w:val="25"/>
           <w:rtl/>
         </w:rPr>
-        <w:t>והוא ענה שפיזור שאריות מול ערכים מנובאים אמור להיראות כמו ענן חסר צורה סביב האפס, וכל עקמומיות נראית לעין, צורת משפך, או מגמה, מסמנת הפרת הנחה. לבדיקת נורמליות ספציפית, תרשים Q-Q משווה את האחוזונים של השאריות לאחוזונים שהיו מתקבלים מהתפלגות נורמלית מושלמת: נקודות שנצמדות לקו האלכסוני אומרות שהשאריות נראות נורמליות, ועקמומיות שיטתית ממנו, בעיקר בקצוות, אומרת שהן לא.</w:t>
+        <w:t>והוא ענה שההפרה מאיימת בעיקר על הדיוק של השגיאות התקניות ורמות המובהקות המדווחות, במיוחד במדגמים קטנים, ולא על האומדן עצמו, שנשאר חסר הטיה כל עוד שאר ההנחות, כמו לינאריות ואי-תלות בין השגיאות, כן מתקיימות. עם 244 תצפיות זה גם משנה פחות משזה נשמע: משפט הגבול המרכזי מבטיח שהתפלגות הדגימה של האומדנים עצמם מתקרבת לנורמלית גם כשהשאריות הגולמיות לא באמת נורמליות, כך שהוא עושה חלק ניכר מהעבודה שהנחת הנורמליות הייתה אמורה לעשות עבור תקפות המבחנים הסטטיסטיים.</w:t>
       </w:r>
     </w:p>
     <w:p>
       <w:pPr>
+        <w:spacing w:after="160"/>
+        <w:jc w:val="both"/>
         <w:bidi/>
-        <w:spacing w:after="160" w:before="0"/>
-        <w:jc w:val="both"/>
       </w:pPr>
       <w:r>
         <w:rPr>
           <w:rFonts w:ascii="David" w:hAnsi="David" w:cs="David" w:eastAsia="David"/>
           <w:b w:val="0"/>
-          <w:i w:val="0"/>
           <w:sz w:val="25"/>
           <w:rtl/>
         </w:rPr>
-        <w:t>כדאי לבדוק את זה בפועל ולא רק להניח שההנחות מתקיימות. שלושה גרפים זה לצד זה: הראשון הוא שאריות המודל מול הערכים המנובאים. השני הוא היסטוגרמה של השאריות. השלישי הוא תרשים ה-Q-Q שכבר תואר למעלה. הרצתי גם מבחן שפירו-וילק פורמלי לנורמליות, ויצא עם ערך מובהקות זעיר, אז שאלתי את הצ'אט מה זה בעצם אומר כאן, לאור זה שהמקדם עצמו נראה תקין:</w:t>
+        <w:t>עכשיו לאותו מודל בדיוק, בגישה הבייסאנית, ב-PyMC, וצריך לבחור פריור לכל פרמטר לא ידוע במודל, כלומר לכל גודל שאנחנו רוצים לאמוד ולא צופים ישירות בדאטה, במקרה הזה החיתוך, השיפוע, וסיגמא שהיא סטיית התקן של הרעש. פריור הוא ההנחה שלנו, כהתפלגות הסתברות, על הערכים הסבירים של פרמטר כזה עוד לפני שראינו בכלל את הדאטה. לפני שדוגמים בפועל, יש כאן דיאגרמה גרפית של מבנה המודל: סיגמא, החיתוך והשיפוע מופיעים כעיגולים פתוחים, כי הם נסתרים ולא ידועים ולכן צריך להם פריור, וכולם מזינים חץ לתוך הטיפ, שמופיע כעיגול מוצל כי הוא נצפה, יש לנו את הנתונים בפועל. שאלתי את הצ'אט אילו פריורים כדאי לבחור לפרמטרים האלה ולמה:</w:t>
       </w:r>
     </w:p>
     <w:p>
       <w:pPr>
-        <w:spacing w:after="160" w:before="80"/>
+        <w:spacing w:before="80" w:after="160"/>
         <w:jc w:val="left"/>
         <w:shd w:val="clear" w:fill="EEF3FB"/>
       </w:pPr>
@@ -366,143 +330,53 @@
         <w:rPr>
           <w:rFonts w:ascii="Segoe UI" w:hAnsi="Segoe UI" w:cs="Segoe UI" w:eastAsia="Segoe UI"/>
           <w:b/>
-          <w:i w:val="0"/>
           <w:sz w:val="24"/>
         </w:rPr>
-        <w:t>Chat, what does a low Shapiro-Wilk p-value here actually mean, given the coefficient estimate itself still looked fine above?</w:t>
+        <w:t>Chat, which priors should I choose for the intercept, slope, and sigma here, and why?</w:t>
       </w:r>
     </w:p>
     <w:p>
       <w:pPr>
+        <w:spacing w:after="160"/>
+        <w:jc w:val="both"/>
         <w:bidi/>
-        <w:spacing w:after="160" w:before="0"/>
-        <w:jc w:val="both"/>
       </w:pPr>
       <w:r>
         <w:rPr>
           <w:rFonts w:ascii="David" w:hAnsi="David" w:cs="David" w:eastAsia="David"/>
           <w:b w:val="0"/>
-          <w:i w:val="0"/>
           <w:sz w:val="25"/>
           <w:rtl/>
         </w:rPr>
-        <w:t>והוא ענה שערך מובהקות זעיר במבחן שפירו-וילק דוחה את ההנחה שהשאריות מתפלגות נורמלית, ואכן, הענן בגרף הראשון מראה נטייה קלה ימינה, והתרשים השלישי מתעקל בקצה העליון שלו, אז זו הפרה אמיתית וניתנת לזיהוי, לא אזעקת שווא. אבל זה בעיקר מאיים על הדיוק המדויק של השגיאות התקניות ורמות המובהקות במדגמים קטנים, ולא על האומדן עצמו, שנשאר חסר הטיה כל עוד שאר ההנחות מתקיימות. עם 244 תצפיות, משפט הגבול המרכזי גם עושה חלק מהעבודה שהנחת הנורמליות הייתה אמורה לעשות עבור המבחנים הסטטיסטיים.</w:t>
+        <w:t>והוא ענה שסיגמא, שהיא סטיית התקן של הרעש, חייבת להיות חיובית, ולכן לא ניתן לשים עליה פריור נורמלי רגיל שנותן גם ערכים שליליים, ולכן הציע HalfCauchy עם פרמטר סקאלה 2, התפלגות עם זנב כבד מאוד שכמעט לא מגבילה ערכים גדולים ונותנת לנתונים לדבר בעצמם, ולכן היא הבחירה הסטנדרטית לפרמטרי שונות. לחיתוך ולשיפוע הציע פריור נורמלי רחב, עם ממוצע אפס וסטיית תקן 5, שבעצם אומר "הייתי מופתעת מקשר שגדול מעשרה דולר בערך", מגבלה רחבה מאוד ביחס לטווח האמיתי של טיפים, שנע בערך בין דולר לעשרה דולר, כך שהיא כמעט לא מכתיבה תשובה ורק חוסמת ערכים אבסורדיים. בקוד זה מתורגם ל-pm.HalfCauchy לסיגמא ול-pm.Normal לחיתוך ולשיפוע.</w:t>
       </w:r>
     </w:p>
     <w:p>
       <w:pPr>
+        <w:spacing w:after="160"/>
+        <w:jc w:val="both"/>
         <w:bidi/>
-        <w:spacing w:after="160" w:before="0"/>
-        <w:jc w:val="both"/>
       </w:pPr>
       <w:r>
         <w:rPr>
           <w:rFonts w:ascii="David" w:hAnsi="David" w:cs="David" w:eastAsia="David"/>
           <w:b w:val="0"/>
-          <w:i w:val="0"/>
           <w:sz w:val="25"/>
           <w:rtl/>
         </w:rPr>
-        <w:t>עכשיו לאותו מודל בדיוק, בגישה הבייסאנית, ב-PyMC, וצריך לבחור פריורים. לפני שדוגמים בפועל, יש כאן דיאגרמה גרפית של מבנה המודל: סיגמא, החיתוך והשיפוע מופיעים כעיגולים פתוחים, כי הם נסתרים ולא ידועים, וכולם מזינים חץ לתוך הטיפ, שמופיע כעיגול מוצל כי הוא נצפה, יש לנו את הנתונים בפועל. שאלתי את הצ'אט למה הבחירות שלי לפריורים סבירות:</w:t>
+        <w:t>אחרי הדגימה, אני מציגה את הפוסטריורי עם az.plot_dist, בשלושה פאנלים נפרדים, אחד לכל פרמטר (חיתוך, שיפוע וסיגמא). בכל פאנל ציר ה-X הוא הערך האפשרי של הפרמטר וציר ה-Y הוא צפיפות ההסתברות, עם עקומה שמראה כמה סביר כל ערך, וקו אופקי מתחת לעקומה שמסמן את טווח האמון של 95 אחוז, עם נקודה במרכזו שמסמנת את הממוצע והערך המספרי שלו כתובת מעליה. הממוצעים שיצאו כאן: כ-0.92 לחיתוך, כ-0.11 לשיפוע, קרוב מאוד למקדם ה-OLS שכבר ראינו למעלה, וכ-1.0 לסיגמא.</w:t>
       </w:r>
     </w:p>
     <w:p>
       <w:pPr>
-        <w:spacing w:after="160" w:before="80"/>
-        <w:jc w:val="left"/>
-        <w:shd w:val="clear" w:fill="EEF3FB"/>
-      </w:pPr>
-      <w:r>
-        <w:rPr>
-          <w:rFonts w:ascii="Segoe UI" w:hAnsi="Segoe UI" w:cs="Segoe UI" w:eastAsia="Segoe UI"/>
-          <w:b/>
-          <w:i w:val="0"/>
-          <w:sz w:val="24"/>
-        </w:rPr>
-        <w:t xml:space="preserve">Chat, why are </w:t>
-      </w:r>
-      <w:r>
-        <w:rPr>
-          <w:rFonts w:ascii="Consolas" w:hAnsi="Consolas" w:cs="Consolas" w:eastAsia="Consolas"/>
-          <w:b/>
-          <w:i w:val="0"/>
-          <w:sz w:val="23"/>
-        </w:rPr>
-        <w:t>HalfCauchy(beta=2)</w:t>
-      </w:r>
-      <w:r>
-        <w:rPr>
-          <w:rFonts w:ascii="Segoe UI" w:hAnsi="Segoe UI" w:cs="Segoe UI" w:eastAsia="Segoe UI"/>
-          <w:b/>
-          <w:i w:val="0"/>
-          <w:sz w:val="24"/>
-        </w:rPr>
-        <w:t xml:space="preserve"> for sigma and </w:t>
-      </w:r>
-      <w:r>
-        <w:rPr>
-          <w:rFonts w:ascii="Consolas" w:hAnsi="Consolas" w:cs="Consolas" w:eastAsia="Consolas"/>
-          <w:b/>
-          <w:i w:val="0"/>
-          <w:sz w:val="23"/>
-        </w:rPr>
-        <w:t>Normal(0, 5)</w:t>
-      </w:r>
-      <w:r>
-        <w:rPr>
-          <w:rFonts w:ascii="Segoe UI" w:hAnsi="Segoe UI" w:cs="Segoe UI" w:eastAsia="Segoe UI"/>
-          <w:b/>
-          <w:i w:val="0"/>
-          <w:sz w:val="24"/>
-        </w:rPr>
-        <w:t xml:space="preserve"> for the coefficients reasonable priors here?</w:t>
-      </w:r>
-    </w:p>
-    <w:p>
-      <w:pPr>
+        <w:spacing w:before="360" w:after="160"/>
+        <w:jc w:val="right"/>
         <w:bidi/>
-        <w:spacing w:after="160" w:before="0"/>
-        <w:jc w:val="both"/>
-      </w:pPr>
-      <w:r>
-        <w:rPr>
-          <w:rFonts w:ascii="David" w:hAnsi="David" w:cs="David" w:eastAsia="David"/>
-          <w:b w:val="0"/>
-          <w:i w:val="0"/>
-          <w:sz w:val="25"/>
-          <w:rtl/>
-        </w:rPr>
-        <w:t>והוא ענה שסיגמא, שהיא סטיית התקן של הרעש, חייבת להיות חיובית, ולכן אי אפשר לשים עליה פריור נורמלי רגיל שנותן גם ערכים שליליים. HalfCauchy היא התפלגות עם זנב כבד מאוד, שכמעט לא מגבילה ערכים גדולים ונותנת לנתונים לדבר בעצמם, ולכן היא הבחירה הסטנדרטית לפרמטרי שונות. פריור נורמלי רחב לחיתוך ולשיפוע בעצם אומר "הייתי מופתעת מקשר שגדול מעשרה דולר בערך", מגבלה רחבה מאוד ביחס לטווח האמיתי של טיפים, שנע בערך בין דולר לעשרה דולר, כך שהיא כמעט לא מכתיבה תשובה ורק חוסמת ערכים אבסורדיים.</w:t>
-      </w:r>
-    </w:p>
-    <w:p>
-      <w:pPr>
-        <w:bidi/>
-        <w:spacing w:after="160" w:before="0"/>
-        <w:jc w:val="both"/>
-      </w:pPr>
-      <w:r>
-        <w:rPr>
-          <w:rFonts w:ascii="David" w:hAnsi="David" w:cs="David" w:eastAsia="David"/>
-          <w:b w:val="0"/>
-          <w:i w:val="0"/>
-          <w:sz w:val="25"/>
-          <w:rtl/>
-        </w:rPr>
-        <w:t>אחרי הדגימה, הפוסטריורי מוצג בשלושה פאנלים נפרדים, אחד לכל פרמטר, חיתוך, שיפוע וסיגמא: בכל פאנל ציר ה-X הוא הערך האפשרי של הפרמטר וציר ה-Y הוא צפיפות ההסתברות, עם עקומה שמראה כמה סביר כל ערך, קו שמסמן את אומדן הנקודה, ותחום מוצלל שמסמן את רווח האמון.</w:t>
-      </w:r>
-    </w:p>
-    <w:p>
-      <w:pPr>
-        <w:bidi/>
-        <w:spacing w:after="120" w:before="280"/>
-        <w:jc w:val="right"/>
       </w:pPr>
       <w:r>
         <w:rPr>
           <w:rFonts w:ascii="David" w:hAnsi="David" w:cs="David" w:eastAsia="David"/>
           <w:b/>
-          <w:i w:val="0"/>
           <w:sz w:val="26"/>
           <w:rtl/>
         </w:rPr>
@@ -511,49 +385,30 @@
     </w:p>
     <w:p>
       <w:pPr>
+        <w:spacing w:after="160"/>
+        <w:jc w:val="both"/>
         <w:bidi/>
-        <w:spacing w:after="160" w:before="0"/>
-        <w:jc w:val="both"/>
       </w:pPr>
       <w:r>
         <w:rPr>
           <w:rFonts w:ascii="David" w:hAnsi="David" w:cs="David" w:eastAsia="David"/>
           <w:b w:val="0"/>
-          <w:i w:val="0"/>
           <w:sz w:val="25"/>
           <w:rtl/>
         </w:rPr>
-        <w:t>עוד נקודת גרסה שכדאי לציין בקול, כי בדיוק כזאת בעיה שקטה קל לפספס: בגרסת arviz הנוכחית, כשמבקשים טבלת סיכום עם רווח מסוים בלי לציין איזה סוג רווח, ברירת המחדל השתנתה לרווח דו-קצוותי, לא ל-HDI כמו שהיה בעבר. מכיוון שבגרף הבא אני קוראת לרווח הזה "HDI" בפירוש, ביקשתי את ה-HDI במפורש בקוד ולא הסתמכתי על ברירת המחדל השקטה, בדיוק כדי שהתווית בגרף תהיה נכונה ולא רק כמעט נכונה.</w:t>
+        <w:t>עכשיו הרגע המרכזי: עם az.summary אני מוציאה את סיכום הפוסטריורי, והמקדמים והרווחים מוצגים אחד ליד השני, בטבלה ובגרף עם שתי שורות, חיתוך ושיפוע, וכל שורה עם שתי נקודות וקווי שגיאה: נקודה אחת ל-OLS ונקודה שנייה, מתחתיה, לבייסאני. עם כמעט 244 נקודות ופריור כמעט שטוח, השיפוע הבייסאני והשיפוע של OLS יוצאים כמעט זהים ממש, וכך גם רווחי הסמך שלהם. זה לא מקרי: יש תוצאה סטטיסטית ידועה שאומרת שכשיש מספיק דאטה והפריור חלש יחסית לעדות שבנתונים, בדיוק המצב כאן, הפוסטריורי הבייסאני מתכנס לאותו ממוצע ולאותה רמת אי-ודאות כמו האומדן הקלאסי. הערך המוסף של הגישה הבייסאנית כאן הוא לכן לא תשובה שונה למודל הפשוט הזה, אלא הכלים שנבנים סביב הפוסטריורי המלא, שנראה מיד.</w:t>
       </w:r>
     </w:p>
     <w:p>
       <w:pPr>
+        <w:spacing w:before="360" w:after="160"/>
+        <w:jc w:val="right"/>
         <w:bidi/>
-        <w:spacing w:after="160" w:before="0"/>
-        <w:jc w:val="both"/>
-      </w:pPr>
-      <w:r>
-        <w:rPr>
-          <w:rFonts w:ascii="David" w:hAnsi="David" w:cs="David" w:eastAsia="David"/>
-          <w:b w:val="0"/>
-          <w:i w:val="0"/>
-          <w:sz w:val="25"/>
-          <w:rtl/>
-        </w:rPr>
-        <w:t>עכשיו הרגע המרכזי: המקדמים והרווחים מוצגים אחד ליד השני, בטבלה ובגרף עם שתי שורות, חיתוך ושיפוע, וכל שורה עם שתי נקודות וקווי שגיאה: נקודה אחת ל-OLS ונקודה שנייה, מתחתיה, לבייסאני. עם כמעט 244 נקודות ופריור כמעט שטוח, השיפוע הבייסאני והשיפוע של OLS יוצאים כמעט זהים ממש, וכך גם רווחי הסמך שלהם, בדיוק כמו שהתאוריה הא-סימפטוטית מנבאת. הערך המוסף של הגישה הבייסאנית כאן הוא לא תשובה שונה למודל הפשוט הזה, אלא הכלים שנבנים סביב הפוסטריורי, שנראה עכשיו.</w:t>
-      </w:r>
-    </w:p>
-    <w:p>
-      <w:pPr>
-        <w:bidi/>
-        <w:spacing w:after="120" w:before="280"/>
-        <w:jc w:val="right"/>
       </w:pPr>
       <w:r>
         <w:rPr>
           <w:rFonts w:ascii="David" w:hAnsi="David" w:cs="David" w:eastAsia="David"/>
           <w:b/>
-          <w:i w:val="0"/>
           <w:sz w:val="26"/>
           <w:rtl/>
         </w:rPr>
@@ -562,24 +417,23 @@
     </w:p>
     <w:p>
       <w:pPr>
+        <w:spacing w:after="160"/>
+        <w:jc w:val="both"/>
         <w:bidi/>
-        <w:spacing w:after="160" w:before="0"/>
-        <w:jc w:val="both"/>
       </w:pPr>
       <w:r>
         <w:rPr>
           <w:rFonts w:ascii="David" w:hAnsi="David" w:cs="David" w:eastAsia="David"/>
           <w:b w:val="0"/>
-          <w:i w:val="0"/>
           <w:sz w:val="25"/>
           <w:rtl/>
         </w:rPr>
-        <w:t>יש כאן גרף חדש שממחיש איך נראית תחזית מלאה: ציר ה-X הוא סכום החשבון וציר ה-Y הוא הטיפ, עם שלוש שכבות: קו ברור אחד שמייצג את הממוצע הפוסטריורי של קו הרגרסיה, רצועה צרה יחסית סביבו שמייצגת רווח אמון על מיקום הקו עצמו, ורצועה הרבה יותר רחבה שמייצגת רווח אמון על תחזית לתצפית חדשה, שכוללת גם את הרעש הרגיל. מתחת לכול, נקודות הפיזור של הדאטה האמיתי. שאלתי את הצ'אט למה הרצועות מתנהגות אחרת זו מזו:</w:t>
+        <w:t>הנה דוגמה קונקרטית לאותם כלים, בעזרת pm.sample_posterior_predictive ו-az.hdi. יש כאן גרף חדש שממחיש איך נראית תחזית שכוללת את אי-הוודאות שלה, לא רק ערך בודד כמו שרגרסיה רגילה נותנת, משהו שה-OLS לא נותן ישירות. ציר ה-X הוא סכום החשבון וציר ה-Y הוא הטיפ, ויש כאן שלוש שכבות: קו ברור אחד שמייצג את הממוצע הפוסטריורי של קו הרגרסיה, רצועה צרה יחסית סביבו שמייצגת רווח אמון על מיקום הקו עצמו, ורצועה הרבה יותר רחבה שמייצגת רווח אמון על תחזית לתצפית חדשה, שכוללת גם את הרעש הרגיל. מתחת לכול, נקודות הפיזור של הדאטה האמיתי. שאלתי את הצ'אט למה הרצועות מתנהגות אחרת זו מזו:</w:t>
       </w:r>
     </w:p>
     <w:p>
       <w:pPr>
-        <w:spacing w:after="160" w:before="80"/>
+        <w:spacing w:before="80" w:after="160"/>
         <w:jc w:val="left"/>
         <w:shd w:val="clear" w:fill="EEF3FB"/>
       </w:pPr>
@@ -587,7 +441,6 @@
         <w:rPr>
           <w:rFonts w:ascii="Segoe UI" w:hAnsi="Segoe UI" w:cs="Segoe UI" w:eastAsia="Segoe UI"/>
           <w:b/>
-          <w:i w:val="0"/>
           <w:sz w:val="24"/>
         </w:rPr>
         <w:t>Chat, why do the predictive-interval bands stay roughly constant width while the HDI bands narrow toward the middle of the data?</w:t>
@@ -595,32 +448,30 @@
     </w:p>
     <w:p>
       <w:pPr>
+        <w:spacing w:after="160"/>
+        <w:jc w:val="both"/>
         <w:bidi/>
-        <w:spacing w:after="160" w:before="0"/>
-        <w:jc w:val="both"/>
       </w:pPr>
       <w:r>
         <w:rPr>
           <w:rFonts w:ascii="David" w:hAnsi="David" w:cs="David" w:eastAsia="David"/>
           <w:b w:val="0"/>
-          <w:i w:val="0"/>
           <w:sz w:val="25"/>
           <w:rtl/>
         </w:rPr>
-        <w:t>והוא ענה שהרצועה הפנימית משקפת רק חוסר ודאות על מיקום הקו, שהכי קטן במרכז הדאטה וגדל בקצוות, בצורת שעון חול. הרצועה החיצונית מוסיפה על זה גם את הרעש השיורי, שההנחה שלנו עליו קבועה בכל טווח, וזה הרבה יותר גדול מהשינוי הקטן ברוחב הרצועה הפנימית, כך שהוא בולע אותו כמעט לגמרי ונראה כמעט קבוע.</w:t>
+        <w:t>והוא ענה שהרצועה הפנימית משקפת רק חוסר ודאות על מיקום הקו עצמו, שהכי קטן במרכז הדאטה וגדל בקצוות, בצורת שעון חול. הרצועה החיצונית מוסיפה על זה עוד מקור אי-ודאות, נפרד לגמרי: גם אם ידענו בדיוק איפה הקו נמצא, טיפ בודד וחדש עדיין לא ייפול בדיוק עליו, כי יש שונות טבעית בין אנשים שהמודל לא מסביר, למשל מצב רוח או איכות השירות, וזה בדיוק מה שסיגמא בקוד מייצגת. אנחנו מניחים שהשונות הזו קבועה לאורך כל טווח סכומי החשבון, וגודלה הרבה יותר גדול מהשינוי הקטן ברוחב הרצועה הפנימית, כך שהיא בולעת אותו כמעט לגמרי ונראית כמעט קבועה.</w:t>
       </w:r>
     </w:p>
     <w:p>
       <w:pPr>
+        <w:spacing w:before="360" w:after="160"/>
+        <w:jc w:val="right"/>
         <w:bidi/>
-        <w:spacing w:after="160" w:before="360"/>
-        <w:jc w:val="right"/>
       </w:pPr>
       <w:r>
         <w:rPr>
           <w:rFonts w:ascii="David" w:hAnsi="David" w:cs="David" w:eastAsia="David"/>
           <w:b/>
-          <w:i w:val="0"/>
           <w:sz w:val="29"/>
           <w:rtl/>
         </w:rPr>
@@ -629,24 +480,23 @@
     </w:p>
     <w:p>
       <w:pPr>
+        <w:spacing w:after="160"/>
+        <w:jc w:val="both"/>
         <w:bidi/>
-        <w:spacing w:after="160" w:before="0"/>
-        <w:jc w:val="both"/>
       </w:pPr>
       <w:r>
         <w:rPr>
           <w:rFonts w:ascii="David" w:hAnsi="David" w:cs="David" w:eastAsia="David"/>
           <w:b w:val="0"/>
-          <w:i w:val="0"/>
           <w:sz w:val="25"/>
           <w:rtl/>
         </w:rPr>
-        <w:t>כדי להראות בפועל מה אלגוריתם ה-MCMC עצמו עושה מאחורי הקלעים, ולא רק לדבר על זה תיאורטית, יש כאן גרסה פשוטה יותר של המודל: אותו חיתוך ושיפוע, אבל הפעם עם סיגמא קבועה על אחת ולא פרמטר נלמד, כלומר הטיפ שווה לחיתוך ועוד שיפוע כפול סכום החשבון ועוד רעש נורמלי עם סטיית תקן קבועה של אחת. הסיבה לפישוט: עם רק שני פרמטרים חופשיים, חיתוך ושיפוע, אפשר להסתכל ישירות על כל הפוסטריורי המשותף שלהם בשני ממדים על גרף אחד, בלי מימד שלישי של אי-ודאות שהיה מסבך את התמונה. גרף הפיזור הדו-ממדי של הדגימות: ציר ה-X הוא ערכי החיתוך שנדגמו, ציר ה-Y הוא ערכי השיפוע שנדגמו, וכל נקודה היא דגימה אחת מהשרשרת. הענן יוצא בצורת אליפסה. שאלתי את הצ'אט למה זה קורה, ואם אפשר לראות את זה בלי MCMC בכלל:</w:t>
+        <w:t>כדי להראות בפועל מה אלגוריתם ה-MCMC עצמו עושה מאחורי הקלעים, ולא רק לדבר על זה תיאורטית, יש כאן גרסה פשוטה יותר של המודל: אותו חיתוך ושיפוע, אבל הפעם עם סיגמא קבועה על אחת ולא פרמטר נלמד, כלומר הטיפ שווה לחיתוך ועוד שיפוע כפול סכום החשבון ועוד רעש נורמלי עם סטיית תקן קבועה של אחת. הסיבה לפישוט היא שעם רק שני פרמטרים חופשיים, חיתוך ושיפוע, אפשר להסתכל ישירות על כל הפוסטריורי המשותף שלהם בשני ממדים על גרף אחד, בלי מימד שלישי של אי-ודאות שהיה מסבך את התמונה. בגרף הפיזור הדו-ממדי של הדגימות, שמצוייר עם az.plot_pair, כל נקודה היא דגימה אחת מהשרשרת: ציר ה-X הוא ערכי החיתוך שנדגמו וציר ה-Y הוא ערכי השיפוע שנדגמו. הענן יוצא כרצועה אלכסונית צרה וארוכה, בגלל הקורלציה השלילית החזקה בין החיתוך לשיפוע. שאלתי את הצ'אט למה זה קורה, ואם אפשר לראות את זה בלי MCMC בכלל:</w:t>
       </w:r>
     </w:p>
     <w:p>
       <w:pPr>
-        <w:spacing w:after="160" w:before="80"/>
+        <w:spacing w:before="80" w:after="160"/>
         <w:jc w:val="left"/>
         <w:shd w:val="clear" w:fill="EEF3FB"/>
       </w:pPr>
@@ -654,7 +504,6 @@
         <w:rPr>
           <w:rFonts w:ascii="Segoe UI" w:hAnsi="Segoe UI" w:cs="Segoe UI" w:eastAsia="Segoe UI"/>
           <w:b/>
-          <w:i w:val="0"/>
           <w:sz w:val="24"/>
         </w:rPr>
         <w:t>Chat, why does the joint posterior of intercept and slope look like a 2D Gaussian, and is there a way to see this without MCMC?</w:t>
@@ -662,15 +511,14 @@
     </w:p>
     <w:p>
       <w:pPr>
+        <w:spacing w:after="160"/>
+        <w:jc w:val="both"/>
         <w:bidi/>
-        <w:spacing w:after="160" w:before="0"/>
-        <w:jc w:val="both"/>
       </w:pPr>
       <w:r>
         <w:rPr>
           <w:rFonts w:ascii="David" w:hAnsi="David" w:cs="David" w:eastAsia="David"/>
           <w:b w:val="0"/>
-          <w:i w:val="0"/>
           <w:sz w:val="25"/>
           <w:rtl/>
         </w:rPr>
@@ -679,24 +527,23 @@
     </w:p>
     <w:p>
       <w:pPr>
+        <w:spacing w:after="160"/>
+        <w:jc w:val="both"/>
         <w:bidi/>
-        <w:spacing w:after="160" w:before="0"/>
-        <w:jc w:val="both"/>
       </w:pPr>
       <w:r>
         <w:rPr>
           <w:rFonts w:ascii="David" w:hAnsi="David" w:cs="David" w:eastAsia="David"/>
           <w:b w:val="0"/>
-          <w:i w:val="0"/>
           <w:sz w:val="25"/>
           <w:rtl/>
         </w:rPr>
-        <w:t>גרף הקונטור הזה, מפת גבהים: ציר ה-X הוא ערכי החיתוך על הרשת, ציר ה-Y הוא ערכי השיפוע, וכל קו מתאר מחבר נקודות באותה צפיפות פוסטריורית, בדיוק אותה צורה אליפטית שהתקבלה מה-MCMC למעלה, רק שהפעם היא חושבה ישירות בלי שום דגימה. שאלתי את הצ'אט על נקודה טכנית בקוד עצמו, ולמה שיטת הרשת מוגבלת:</w:t>
+        <w:t>גרף הקונטור הזה הוא כמו מפת גבהים: ציר ה-X הוא ערכי החיתוך על הרשת, ציר ה-Y הוא ערכי השיפוע, וכל קו מתאר מחבר נקודות באותה צפיפות פוסטריורית, ורואים כאן בבירור צורה אליפטית קלאסית. זו אכן אותה התפלגות בדיוק כמו בענן הדגימות למעלה, לא אליפסה אחרת: הקורלציה בין החיתוך לשיפוע כאן חזקה מאוד, קרוב למינוס 0.91, ולכן האליפסה האמיתית צרה ומאורכת מאוד. בענן הדגימות רוב הנקודות נערמות על הציר הארוך שלה ונראות כמו רצועה, ואילו גרף הקונטור מסמן במפורש כמה רמות צפיפות שונות, כולל האזורים הדלילים יותר בשוליים, ולכן חושף את הצורה האליפטית המלאה. הפעם היא חושבה ישירות בלי שום דגימה. שאלתי את הצ'אט על נקודה טכנית בקוד עצמו, ולמה שיטת הרשת מוגבלת:</w:t>
       </w:r>
     </w:p>
     <w:p>
       <w:pPr>
-        <w:spacing w:after="160" w:before="80"/>
+        <w:spacing w:before="80" w:after="160"/>
         <w:jc w:val="left"/>
         <w:shd w:val="clear" w:fill="EEF3FB"/>
       </w:pPr>
@@ -704,7 +551,6 @@
         <w:rPr>
           <w:rFonts w:ascii="Segoe UI" w:hAnsi="Segoe UI" w:cs="Segoe UI" w:eastAsia="Segoe UI"/>
           <w:b/>
-          <w:i w:val="0"/>
           <w:sz w:val="24"/>
         </w:rPr>
         <w:t>Chat, why is computing the likelihood as a raw product (rather than a sum of logs) problematic here, and why is the grid method only viable for 1-3 parameters?</w:t>
@@ -712,15 +558,14 @@
     </w:p>
     <w:p>
       <w:pPr>
+        <w:spacing w:after="160"/>
+        <w:jc w:val="both"/>
         <w:bidi/>
-        <w:spacing w:after="160" w:before="0"/>
-        <w:jc w:val="both"/>
       </w:pPr>
       <w:r>
         <w:rPr>
           <w:rFonts w:ascii="David" w:hAnsi="David" w:cs="David" w:eastAsia="David"/>
           <w:b w:val="0"/>
-          <w:i w:val="0"/>
           <w:sz w:val="25"/>
           <w:rtl/>
         </w:rPr>
@@ -729,75 +574,71 @@
     </w:p>
     <w:p>
       <w:pPr>
+        <w:spacing w:before="360" w:after="160"/>
+        <w:jc w:val="right"/>
         <w:bidi/>
-        <w:spacing w:after="160" w:before="360"/>
-        <w:jc w:val="right"/>
       </w:pPr>
       <w:r>
         <w:rPr>
           <w:rFonts w:ascii="David" w:hAnsi="David" w:cs="David" w:eastAsia="David"/>
           <w:b/>
-          <w:i w:val="0"/>
           <w:sz w:val="29"/>
           <w:rtl/>
         </w:rPr>
-        <w:t>רגרסיה היררכית: MixedLM מול בייסאני</w:t>
+        <w:t>רגרסיה היררכית: מודל בייסאני</w:t>
       </w:r>
     </w:p>
     <w:p>
       <w:pPr>
+        <w:spacing w:after="160"/>
+        <w:jc w:val="both"/>
         <w:bidi/>
-        <w:spacing w:after="160" w:before="0"/>
-        <w:jc w:val="both"/>
       </w:pPr>
       <w:r>
         <w:rPr>
           <w:rFonts w:ascii="David" w:hAnsi="David" w:cs="David" w:eastAsia="David"/>
           <w:b w:val="0"/>
-          <w:i w:val="0"/>
           <w:sz w:val="25"/>
           <w:rtl/>
         </w:rPr>
-        <w:t>עכשיו לשאלה המרכזית של המחברת הזו: האם הקשר בין חשבון לטיפ שונה בין הימים, במיוחד ביום שישי, שיש לו רק תשע-עשרה תצפיות, הרבה פחות מהימים האחרים. בודקת את זה קודם בדרך הקלאסית, עם מודל אפקטים מעורבים.</w:t>
+        <w:t>עכשיו לשאלה המרכזית של המחברת הזו: האם הקשר בין חשבון לטיפ שונה בין הימים, במיוחד ביום שישי, שיש לו רק תשע-עשרה תצפיות, הרבה פחות מהימים האחרים. בודקת את זה בגישה הבייסאנית, במודל היררכי, בפרמטריזציה ממורכזת: לכל יום יש חיתוך ושיפוע משלו, אבל בניגוד למודל הבסיסי, הם לא מקבלים פריור קבוע ונפרד. במקום זה, ארבעת החיתוכים נשלפים יחד מהתפלגות נורמלית משותפת, וארבעת השיפועים נשלפים יחד מהתפלגות נורמלית משותפת אחרת, כשהממוצע והשונות של כל התפלגות כזו, פריורי-העל, נאמדים בעצמם מהנתונים. בדיאגרמת המודל רואים את זה ישירות: במודל הבסיסי היו רק שלושה עיגולים שמזינים את הטיפ; כאן יש שכבה נוספת מעל החיתוך והשיפוע של כל יום, פריורי-העל שמהם הם נשלפים. זה בדיוק מה שיאפשר ליום עם מעט תצפיות, כמו יום שישי, להישען על המידע מהימים האחרים.</w:t>
       </w:r>
     </w:p>
     <w:p>
       <w:pPr>
+        <w:spacing w:after="160"/>
+        <w:jc w:val="both"/>
         <w:bidi/>
-        <w:spacing w:after="160" w:before="0"/>
-        <w:jc w:val="both"/>
       </w:pPr>
       <w:r>
         <w:rPr>
           <w:rFonts w:ascii="David" w:hAnsi="David" w:cs="David" w:eastAsia="David"/>
           <w:b w:val="0"/>
-          <w:i w:val="0"/>
           <w:sz w:val="25"/>
           <w:rtl/>
         </w:rPr>
-        <w:t>בפלט של המודל הזה יש כמה שורות שכדאי לפרק. מספר הקבוצות הוא ארבע, כמספר הימים. שיטת האמידה שכתובה שם היא נראות מוגבלת, שהיא וריאציה על נראות מרבית המיועדת במיוחד לאמידת רכיבי שונות: נראות מרבית רגילה נוטה להעריך שונות בין-קבוצתית בחסר כשיש מעט קבוצות, והשיטה הזו מתקנת את ההטיה הזאת. כשהרצתי את זה קפצה אזהרת אי-התכנסות אמיתית, וכדאי לספר עליה בקול ולא להסתיר: עם רק ארבע קבוצות, לאלגוריתם יש מעט מאוד מידע כדי לקבוע את מבנה השונות ביניהן, וזה מוכר. השתמשתי בתוצאה בכל זאת, כי ניסיון חוזר עם שיטת אופטימיזציה אחרת כן התכנס לתשובה סבירה. בטבלת המקדמים עצמה, מקדם החיתוך יצא סביב 0.95 עם מובהקות גבוהה, ומקדם סכום החשבון יצא סביב 0.104, קרוב מאוד למה שקיבלנו ב-OLS הרגיל. השונות בין הימים עצמם, שמופיעה בשורה נפרדת, נותנת מושג כמה הימים שונים זה מזה.</w:t>
+        <w:t>נקודה אחת שכדאי להזכיר מהקוד עצמו: אני ממרכזת את משתנה סכום החשבון לפני בניית המודל, כי סכום החשבון הגולמי רחוק מאוד מאפס, וחיתוך שמוגדר סביבו היה מייצג טיפ צפוי ב"חשבון של אפס דולר", מצב שכמעט לא קיים ופוגע בגיאומטריה של הדגימה. אחרי מירכוז, החיתוך מייצג "טיפ בחשבון בגודל ממוצע", יציב ופרשני הרבה יותר.</w:t>
       </w:r>
     </w:p>
     <w:p>
       <w:pPr>
+        <w:spacing w:after="160"/>
+        <w:jc w:val="both"/>
         <w:bidi/>
-        <w:spacing w:after="160" w:before="0"/>
-        <w:jc w:val="both"/>
       </w:pPr>
       <w:r>
         <w:rPr>
           <w:rFonts w:ascii="David" w:hAnsi="David" w:cs="David" w:eastAsia="David"/>
           <w:b w:val="0"/>
-          <w:i w:val="0"/>
           <w:sz w:val="25"/>
           <w:rtl/>
         </w:rPr>
-        <w:t>שאלתי את הצ'אט מה זה בעצם מודל כזה, ואיך הוא קשור למודל ההיררכי הבייסאני:</w:t>
+        <w:t>אחרי הדגימה, אני מציגה גרף מסלול עם az.plot_trace. בגרף יש פאנל נפרד לכל אחד משבעת הפרמטרים של המודל, שני הפריורים-העל המשותפים לכל הימים, החיתוך והשיפוע הספציפיים ליום שישי, שני פרמטרי השונות בין הימים, וסיגמא של הרעש. בכל פאנל ציר ה-X הוא מספר הדגימה, ציר ה-Y הוא הערך שנדגם, וארבעת הצבעים הם ארבע השרשראות, שצריכות להיראות כמו רעש חסר מבנה שחופף כמעט לגמרי. בפועל זה בדיוק מה שרואים בחמישה מתוך שבעת הפאנלים: השרשראות חופפות ברובן, בלי סטייה שיטתית אחת מהשנייה. בשני פרמטרי השונות בין הימים דווקא כן רואים קפיצות בודדות וגבוהות של שרשרת אחת או שתיים מעל שאר הרעש וזהו רמז לבעיית משפך Neal שנבדקת ישירות בהמשך. שאלתי את הצ'אט אם יש סיבה לדאגה ספציפית לגבי יום שישי, הקבוצה עם הכי מעט תצפיות מכל הימים:</w:t>
       </w:r>
     </w:p>
     <w:p>
       <w:pPr>
-        <w:spacing w:after="160" w:before="80"/>
+        <w:spacing w:before="80" w:after="160"/>
         <w:jc w:val="left"/>
         <w:shd w:val="clear" w:fill="EEF3FB"/>
       </w:pPr>
@@ -805,91 +646,6 @@
         <w:rPr>
           <w:rFonts w:ascii="Segoe UI" w:hAnsi="Segoe UI" w:cs="Segoe UI" w:eastAsia="Segoe UI"/>
           <w:b/>
-          <w:i w:val="0"/>
-          <w:sz w:val="24"/>
-        </w:rPr>
-        <w:t>Chat, what is a linear mixed-effects model, and how is it the classical analogue of a Bayesian hierarchical model?</w:t>
-      </w:r>
-    </w:p>
-    <w:p>
-      <w:pPr>
-        <w:bidi/>
-        <w:spacing w:after="160" w:before="0"/>
-        <w:jc w:val="both"/>
-      </w:pPr>
-      <w:r>
-        <w:rPr>
-          <w:rFonts w:ascii="David" w:hAnsi="David" w:cs="David" w:eastAsia="David"/>
-          <w:b w:val="0"/>
-          <w:i w:val="0"/>
-          <w:sz w:val="25"/>
-          <w:rtl/>
-        </w:rPr>
-        <w:t>והוא ענה שמפרידים בין אפקט קבוע, שהוא החיתוך והשיפוע הממוצעים על פני כל הימים יחד, לבין אפקטים אקראיים, שהם כמה כל יום ספציפי סוטה מהממוצע הזה, ומניחים שהאפקטים האקראיים מגיעים מהתפלגות נורמלית משותפת שהשונות שלה נאמדת מהנתונים עצמם. זו בדיוק אותה מחשבה כמו הפריור-העל המשותף שנבנה בהמשך בגרסה הבייסאנית.</w:t>
-      </w:r>
-    </w:p>
-    <w:p>
-      <w:pPr>
-        <w:bidi/>
-        <w:spacing w:after="160" w:before="0"/>
-        <w:jc w:val="both"/>
-      </w:pPr>
-      <w:r>
-        <w:rPr>
-          <w:rFonts w:ascii="David" w:hAnsi="David" w:cs="David" w:eastAsia="David"/>
-          <w:b w:val="0"/>
-          <w:i w:val="0"/>
-          <w:sz w:val="25"/>
-          <w:rtl/>
-        </w:rPr>
-        <w:t>האומדן הנקודתי לכל יום ספציפי נקרא הטוב ביותר בין האומדנים חסרי ההטיה, ובקיצור באנגלית BLUP. בטבלה שלו: יום שישי יוצא עם סטייה קטנה מהממוצע, ואילו יום ראשון יוצא עם הסטייה הגדולה ביותר.</w:t>
-      </w:r>
-    </w:p>
-    <w:p>
-      <w:pPr>
-        <w:bidi/>
-        <w:spacing w:after="160" w:before="0"/>
-        <w:jc w:val="both"/>
-      </w:pPr>
-      <w:r>
-        <w:rPr>
-          <w:rFonts w:ascii="David" w:hAnsi="David" w:cs="David" w:eastAsia="David"/>
-          <w:b w:val="0"/>
-          <w:i w:val="0"/>
-          <w:sz w:val="25"/>
-          <w:rtl/>
-        </w:rPr>
-        <w:t>עכשיו הגרסה הבייסאנית, בפרמטריזציה ממורכזת: לכל יום יש חיתוך ושיפוע משלו, שנשלפים מהתפלגות נורמלית משותפת שהפרמטרים שלה הם עצמם פריורים שנאמדים מהנתונים. שוב יש כאן דיאגרמה, וההבדל מהמודל הבסיסי בולט מיד: יש שכבה נוספת של עיגולים, פריור-העל, שמעל החיתוך והשיפוע של כל יום. בקוד עצמו יש נקודה שכדאי להזכיר: אני ממרכזת את משתנה סכום החשבון לפני בניית המודל, כלומר מחסירה ממנו את הממוצע שלו. הסיבה: אם משתמשים בסכום החשבון הגולמי, שנע בין שלושה לחמישים דולר בערך, רחוק מאוד מאפס, החיתוך של המודל בעצם מייצג אקסטרפולציה ל"חשבון של אפס דולר", ערך שכמעט לא קיים במציאות, וזה יוצר קורלציה חזקה ומלאכותית בין החיתוך לשיפוע, שפוגעת בגיאומטריה של הדגימה. אחרי מירכוז, החיתוך מייצג "טיפ בחשבון בגודל ממוצע", הרבה יותר יציב ופרשני.</w:t>
-      </w:r>
-    </w:p>
-    <w:p>
-      <w:pPr>
-        <w:bidi/>
-        <w:spacing w:after="160" w:before="0"/>
-        <w:jc w:val="both"/>
-      </w:pPr>
-      <w:r>
-        <w:rPr>
-          <w:rFonts w:ascii="David" w:hAnsi="David" w:cs="David" w:eastAsia="David"/>
-          <w:b w:val="0"/>
-          <w:i w:val="0"/>
-          <w:sz w:val="25"/>
-          <w:rtl/>
-        </w:rPr>
-        <w:t>אחרי הדגימה, גרף מסלול ספציפית ליום שישי, הקבוצה הכי קטנה: פאנל נפרד לכל פרמטר, ציר ה-X מספר הדגימה, ציר ה-Y הערך שנדגם, וארבעת הצבעים הם ארבע השרשראות, שצריכות להיראות כמו רעש חסר מבנה שחופף כמעט לגמרי. שאלתי את הצ'אט אם צריך לדאוג משהו לגבי הקבוצה הכי קטנה הזאת:</w:t>
-      </w:r>
-    </w:p>
-    <w:p>
-      <w:pPr>
-        <w:spacing w:after="160" w:before="80"/>
-        <w:jc w:val="left"/>
-        <w:shd w:val="clear" w:fill="EEF3FB"/>
-      </w:pPr>
-      <w:r>
-        <w:rPr>
-          <w:rFonts w:ascii="Segoe UI" w:hAnsi="Segoe UI" w:cs="Segoe UI" w:eastAsia="Segoe UI"/>
-          <w:b/>
-          <w:i w:val="0"/>
           <w:sz w:val="24"/>
         </w:rPr>
         <w:t>Chat, should I be worried about anything in the trace/summary for the smallest group (Friday, n=19)?</w:t>
@@ -897,15 +653,14 @@
     </w:p>
     <w:p>
       <w:pPr>
+        <w:spacing w:after="160"/>
+        <w:jc w:val="both"/>
         <w:bidi/>
-        <w:spacing w:after="160" w:before="0"/>
-        <w:jc w:val="both"/>
       </w:pPr>
       <w:r>
         <w:rPr>
           <w:rFonts w:ascii="David" w:hAnsi="David" w:cs="David" w:eastAsia="David"/>
           <w:b w:val="0"/>
-          <w:i w:val="0"/>
           <w:sz w:val="25"/>
           <w:rtl/>
         </w:rPr>
@@ -914,15 +669,14 @@
     </w:p>
     <w:p>
       <w:pPr>
+        <w:spacing w:after="160"/>
+        <w:jc w:val="both"/>
         <w:bidi/>
-        <w:spacing w:after="160" w:before="0"/>
-        <w:jc w:val="both"/>
       </w:pPr>
       <w:r>
         <w:rPr>
           <w:rFonts w:ascii="David" w:hAnsi="David" w:cs="David" w:eastAsia="David"/>
           <w:b w:val="0"/>
-          <w:i w:val="0"/>
           <w:sz w:val="25"/>
           <w:rtl/>
         </w:rPr>
@@ -931,41 +685,39 @@
     </w:p>
     <w:p>
       <w:pPr>
+        <w:spacing w:before="360" w:after="160"/>
+        <w:jc w:val="right"/>
         <w:bidi/>
-        <w:spacing w:after="120" w:before="280"/>
-        <w:jc w:val="right"/>
       </w:pPr>
       <w:r>
         <w:rPr>
           <w:rFonts w:ascii="David" w:hAnsi="David" w:cs="David" w:eastAsia="David"/>
           <w:b/>
-          <w:i w:val="0"/>
           <w:sz w:val="26"/>
           <w:rtl/>
         </w:rPr>
-        <w:t>דיברגנסים: משפך של Neal</w:t>
+        <w:t>משפך Neal</w:t>
       </w:r>
     </w:p>
     <w:p>
       <w:pPr>
+        <w:spacing w:after="160"/>
+        <w:jc w:val="both"/>
         <w:bidi/>
-        <w:spacing w:after="160" w:before="0"/>
-        <w:jc w:val="both"/>
       </w:pPr>
       <w:r>
         <w:rPr>
           <w:rFonts w:ascii="David" w:hAnsi="David" w:cs="David" w:eastAsia="David"/>
           <w:b w:val="0"/>
-          <w:i w:val="0"/>
           <w:sz w:val="25"/>
           <w:rtl/>
         </w:rPr>
-        <w:t>עוד כלי אבחון חשוב: גרף פיזור דו-ממדי שבו ציר ה-X הוא השיפוע ביום שישי וציר ה-Y הוא פרמטר השונות המשותף, ובו נקודות שסומנו כדיברגנסים, כלומר כישלונות של האלגוריתם, מודגשות בצבע. הן מתרכזות דווקא באזור שבו פרמטר השונות קטן מאוד. שאלתי את הצ'אט מה אני בעצם רואה כאן, ומה גורם לזה:</w:t>
+        <w:t>עוד כלי אבחון חשוב, שוב עם az.plot_pair, הוא גרף פיזור דו-ממדי: ציר ה-X הוא השיפוע ביום שישי וציר ה-Y הוא פרמטר השונות המשותף, ובו נקודות שסומנו כדיברגנסים, כלומר כישלונות של האלגוריתם, מודגשות בצבע. הן מתרכזות דווקא באזור שבו פרמטר השונות קטן מאוד. שאלתי את הצ'אט מה אני בעצם רואה כאן, ומה גורם לזה:</w:t>
       </w:r>
     </w:p>
     <w:p>
       <w:pPr>
-        <w:spacing w:after="160" w:before="80"/>
+        <w:spacing w:before="80" w:after="160"/>
         <w:jc w:val="left"/>
         <w:shd w:val="clear" w:fill="EEF3FB"/>
       </w:pPr>
@@ -973,7 +725,6 @@
         <w:rPr>
           <w:rFonts w:ascii="Segoe UI" w:hAnsi="Segoe UI" w:cs="Segoe UI" w:eastAsia="Segoe UI"/>
           <w:b/>
-          <w:i w:val="0"/>
           <w:sz w:val="24"/>
         </w:rPr>
         <w:t>Chat, what am I looking for in this pair plot, and what causes it (Neal's funnel)?</w:t>
@@ -981,32 +732,30 @@
     </w:p>
     <w:p>
       <w:pPr>
+        <w:spacing w:after="160"/>
+        <w:jc w:val="both"/>
         <w:bidi/>
-        <w:spacing w:after="160" w:before="0"/>
-        <w:jc w:val="both"/>
       </w:pPr>
       <w:r>
         <w:rPr>
           <w:rFonts w:ascii="David" w:hAnsi="David" w:cs="David" w:eastAsia="David"/>
           <w:b w:val="0"/>
-          <w:i w:val="0"/>
           <w:sz w:val="25"/>
           <w:rtl/>
         </w:rPr>
-        <w:t>והוא ענה שכשלקבוצה יש מעט מאוד מידע משלה, השיפוע שלה והפרמטר המשותף נעשים תלויים חזק זה בזה: פרמטר שונות קטן כופה את השיפוע להיות קרוב מאוד לממוצע, וצורת הפוסטריורי המקומית משתנה בצורה דרסטית בין הצוואר הרחב לגרון הצר של המשפך. גודל צעד קבוע אחד, שהאלגוריתם קובע פעם אחת בתחילת הריצה, פשוט לא יכול להתאים לשני האזורים גם יחד.</w:t>
+        <w:t>והוא ענה שהצורה נקראת משפך כי היא נראית כמו אחד: כשפרמטר השונות המשותף גדול, השיפוע של היום יכול לנוע בטווח רחב סביב הממוצע, כמו הצוואר הרחב של משפך; וכשהוא קטן, השיפוע נכפה להיות קרוב מאוד לממוצע, טווח צר כמו הגרון של המשפך. לקבוצה עם מעט מאוד מידע משלה, כמו יום שישי, השיפוע והפרמטר המשותף נעשים תלויים חזק זה בזה, והפוסטריורי המקומי משתנה בצורה דרסטית בין שני האזורים האלה. גודל צעד קבוע אחד, שהאלגוריתם קובע פעם אחת בתחילת הריצה, פשוט לא יכול להתאים לשניהם גם יחד.</w:t>
       </w:r>
     </w:p>
     <w:p>
       <w:pPr>
+        <w:spacing w:before="360" w:after="160"/>
+        <w:jc w:val="right"/>
         <w:bidi/>
-        <w:spacing w:after="120" w:before="280"/>
-        <w:jc w:val="right"/>
       </w:pPr>
       <w:r>
         <w:rPr>
           <w:rFonts w:ascii="David" w:hAnsi="David" w:cs="David" w:eastAsia="David"/>
           <w:b/>
-          <w:i w:val="0"/>
           <w:sz w:val="26"/>
           <w:rtl/>
         </w:rPr>
@@ -1015,24 +764,23 @@
     </w:p>
     <w:p>
       <w:pPr>
+        <w:spacing w:after="160"/>
+        <w:jc w:val="both"/>
         <w:bidi/>
-        <w:spacing w:after="160" w:before="0"/>
-        <w:jc w:val="both"/>
       </w:pPr>
       <w:r>
         <w:rPr>
           <w:rFonts w:ascii="David" w:hAnsi="David" w:cs="David" w:eastAsia="David"/>
           <w:b w:val="0"/>
-          <w:i w:val="0"/>
           <w:sz w:val="25"/>
           <w:rtl/>
         </w:rPr>
-        <w:t>שני כלי אבחון נוספים: גרף אוטוקורלציה על פרמטר השונות המשותף, ואחריו גרף גודל מדגם אפקטיבי בגרסה מקומית. שאלתי את הצ'אט איך בדיוק מחשבים את זה, ולמה יש סף מומלץ של ארבע מאות:</w:t>
+        <w:t>שני כלי אבחון נוספים: גרף אוטוקורלציה על פרמטר השונות המשותף, ואחריו גרף גודל מדגם אפקטיבי בגרסה מקומית, עם az.plot_ess. שאלתי את הצ'אט איך בדיוק מחשבים את זה, ולמה יש סף מומלץ של ארבע מאות:</w:t>
       </w:r>
     </w:p>
     <w:p>
       <w:pPr>
-        <w:spacing w:after="160" w:before="80"/>
+        <w:spacing w:before="80" w:after="160"/>
         <w:jc w:val="left"/>
         <w:shd w:val="clear" w:fill="EEF3FB"/>
       </w:pPr>
@@ -1040,41 +788,21 @@
         <w:rPr>
           <w:rFonts w:ascii="Segoe UI" w:hAnsi="Segoe UI" w:cs="Segoe UI" w:eastAsia="Segoe UI"/>
           <w:b/>
-          <w:i w:val="0"/>
           <w:sz w:val="24"/>
         </w:rPr>
-        <w:t xml:space="preserve">Chat, how does arviz calculate the autocorrelation shown in </w:t>
-      </w:r>
-      <w:r>
-        <w:rPr>
-          <w:rFonts w:ascii="Consolas" w:hAnsi="Consolas" w:cs="Consolas" w:eastAsia="Consolas"/>
-          <w:b/>
-          <w:i w:val="0"/>
-          <w:sz w:val="23"/>
-        </w:rPr>
-        <w:t>az.plot_autocorr</w:t>
-      </w:r>
-      <w:r>
-        <w:rPr>
-          <w:rFonts w:ascii="Segoe UI" w:hAnsi="Segoe UI" w:cs="Segoe UI" w:eastAsia="Segoe UI"/>
-          <w:b/>
-          <w:i w:val="0"/>
-          <w:sz w:val="24"/>
-        </w:rPr>
-        <w:t>, and why is 400 a common rule-of-thumb target for ESS?</w:t>
+        <w:t>Chat, how does arviz calculate the autocorrelation shown in `az.plot_autocorr`, and why is 400 a common rule-of-thumb target for ESS?</w:t>
       </w:r>
     </w:p>
     <w:p>
       <w:pPr>
+        <w:spacing w:after="160"/>
+        <w:jc w:val="both"/>
         <w:bidi/>
-        <w:spacing w:after="160" w:before="0"/>
-        <w:jc w:val="both"/>
       </w:pPr>
       <w:r>
         <w:rPr>
           <w:rFonts w:ascii="David" w:hAnsi="David" w:cs="David" w:eastAsia="David"/>
           <w:b w:val="0"/>
-          <w:i w:val="0"/>
           <w:sz w:val="25"/>
           <w:rtl/>
         </w:rPr>
@@ -1083,15 +811,14 @@
     </w:p>
     <w:p>
       <w:pPr>
+        <w:spacing w:after="160"/>
+        <w:jc w:val="both"/>
         <w:bidi/>
-        <w:spacing w:after="160" w:before="0"/>
-        <w:jc w:val="both"/>
       </w:pPr>
       <w:r>
         <w:rPr>
           <w:rFonts w:ascii="David" w:hAnsi="David" w:cs="David" w:eastAsia="David"/>
           <w:b w:val="0"/>
-          <w:i w:val="0"/>
           <w:sz w:val="25"/>
           <w:rtl/>
         </w:rPr>
@@ -1100,15 +827,30 @@
     </w:p>
     <w:p>
       <w:pPr>
+        <w:spacing w:after="160"/>
+        <w:jc w:val="both"/>
         <w:bidi/>
-        <w:spacing w:after="120" w:before="280"/>
+      </w:pPr>
+      <w:r>
+        <w:rPr>
+          <w:rFonts w:ascii="David" w:hAnsi="David" w:cs="David" w:eastAsia="David"/>
+          <w:b w:val="0"/>
+          <w:sz w:val="25"/>
+          <w:rtl/>
+        </w:rPr>
+        <w:t>בפועל, האוטוקורלציה של פרמטר השונות המשותף יורדת בחדות כבר מהפיגור הראשון, ומסביב לפיגור חמש היא כבר נשארת כמעט תמיד בתוך רצועת חוסר-המובהקות, סימן להתכנסות מהירה וטובה. גרף ה-ESS המקומי, שמוצג כאן לשיפוע של יום שישי, נשאר גבוה בהרבה מקו הסף לאורך רוב הטווח, בסביבות אלפיים עד למעלה משלושת אלפים, מלבד שקיעה חדה וממוקדת ממש סביב האחוזון החמישים, החציון של הפרמטר, שם ה-ESS צונח לכ-400-600, כמעט נוגע בקו הסף. זה לא כישלון, רק סימן שדווקא סביב הערך המרכזי, איפה שיש הכי הרבה צפיפות אבל גם הכי הרבה חפיפה בין קפיצות ה-MCMC העוקבות, יש מעט פחות דגימות אפקטיביות מאשר בזנבות ההתפלגות.</w:t>
+      </w:r>
+    </w:p>
+    <w:p>
+      <w:pPr>
+        <w:spacing w:before="360" w:after="160"/>
         <w:jc w:val="right"/>
+        <w:bidi/>
       </w:pPr>
       <w:r>
         <w:rPr>
           <w:rFonts w:ascii="David" w:hAnsi="David" w:cs="David" w:eastAsia="David"/>
           <w:b/>
-          <w:i w:val="0"/>
           <w:sz w:val="26"/>
           <w:rtl/>
         </w:rPr>
@@ -1117,15 +859,14 @@
     </w:p>
     <w:p>
       <w:pPr>
+        <w:spacing w:after="160"/>
+        <w:jc w:val="both"/>
         <w:bidi/>
-        <w:spacing w:after="160" w:before="0"/>
-        <w:jc w:val="both"/>
       </w:pPr>
       <w:r>
         <w:rPr>
           <w:rFonts w:ascii="David" w:hAnsi="David" w:cs="David" w:eastAsia="David"/>
           <w:b w:val="0"/>
-          <w:i w:val="0"/>
           <w:sz w:val="25"/>
           <w:rtl/>
         </w:rPr>
@@ -1134,41 +875,39 @@
     </w:p>
     <w:p>
       <w:pPr>
+        <w:spacing w:after="160"/>
+        <w:jc w:val="both"/>
         <w:bidi/>
-        <w:spacing w:after="160" w:before="0"/>
-        <w:jc w:val="both"/>
       </w:pPr>
       <w:r>
         <w:rPr>
           <w:rFonts w:ascii="David" w:hAnsi="David" w:cs="David" w:eastAsia="David"/>
           <w:b w:val="0"/>
-          <w:i w:val="0"/>
           <w:sz w:val="25"/>
           <w:rtl/>
         </w:rPr>
-        <w:t>רגע כנות שחשוב לספר עליו, כי הוא בדיוק הדגמה של לבדוק תשובה ולא לקחת אותה כמובנת מאליה: הריצה הראשונה שלי, לפני מירכוז ה-X, הראתה בכלל לא שיפור דרמטי, כמעט אותו מספר דיברגנסים בשני המודלים. זה היה אמור להדאיג, כי ההסבר של משפך Neal מנבא שיפור גדול. חקרתי את זה במקום להתעלם, ומצאתי בעיה נפרדת ומקבילה: לא מירכזתי את משתנה ה-X עצמו, מה שיוצר בדיוק את בעיית הקורלציה המלאכותית בין החיתוך לשיפוע שהזכרתי קודם, והיא פוגעת בשני המודלים באותה מידה, ובכך מסתירה את התועלת האמיתית של תיקון המשפך. אחרי שמירכזתי את ה-X, קיבלתי את התוצאה האמיתית: מהמודל הממורכז לבדו, עם כ-463 דיברגנסים, למודל הלא-ממורכז, עם 10 בלבד, שיפור דרמטי ואמיתי, בדיוק כמו שהתאוריה חוזה.</w:t>
+        <w:t>רגע כנות שחשוב לספר עליו, כי הוא בדיוק הדגמה של לבדוק תשובה ולא לקחת אותה כמובנת מאליה: הריצה הראשונה שלי, לפני מירכוז ה-X, הראתה בכלל לא שיפור דרמטי, כמעט אותו מספר כישלונות דגימה בשני המודלים. זה היה אמור להדאיג, כי ההסבר של משפך Neal מנבא שיפור גדול. חקרתי את זה במקום להתעלם, ומצאתי בעיה נפרדת ומקבילה: לא מירכזתי את משתנה ה-X עצמו, מה שיוצר בדיוק את בעיית הקורלציה המלאכותית בין החיתוך לשיפוע שהזכרתי קודם, והיא פוגעת בשני המודלים באותה מידה, ובכך מסתירה את התועלת האמיתית של תיקון המשפך. אחרי שמירכזתי את ה-X, קיבלתי את התוצאה האמיתית: מהמודל הממורכז לבדו, עם כ-463 כישלונות דגימה, למודל הלא-ממורכז, עם 10 בלבד, שיפור דרמטי ואמיתי, בדיוק כמו שהתאוריה חוזה.</w:t>
       </w:r>
     </w:p>
     <w:p>
       <w:pPr>
+        <w:spacing w:after="160"/>
+        <w:jc w:val="both"/>
         <w:bidi/>
-        <w:spacing w:after="160" w:before="0"/>
-        <w:jc w:val="both"/>
       </w:pPr>
       <w:r>
         <w:rPr>
           <w:rFonts w:ascii="David" w:hAnsi="David" w:cs="David" w:eastAsia="David"/>
           <w:b w:val="0"/>
-          <w:i w:val="0"/>
           <w:sz w:val="25"/>
           <w:rtl/>
         </w:rPr>
-        <w:t>שאלתי את הצ'אט מה בדיוק ההבדל מהמודל הממורכז, ואיפה ראיתי טריק דומה בעבר:</w:t>
+        <w:t>שאלתי את הצ'אט מה בדיוק ההבדל מהמודל הממורכז:</w:t>
       </w:r>
     </w:p>
     <w:p>
       <w:pPr>
-        <w:spacing w:after="160" w:before="80"/>
+        <w:spacing w:before="80" w:after="160"/>
         <w:jc w:val="left"/>
         <w:shd w:val="clear" w:fill="EEF3FB"/>
       </w:pPr>
@@ -1176,66 +915,62 @@
         <w:rPr>
           <w:rFonts w:ascii="Segoe UI" w:hAnsi="Segoe UI" w:cs="Segoe UI" w:eastAsia="Segoe UI"/>
           <w:b/>
-          <w:i w:val="0"/>
           <w:sz w:val="24"/>
         </w:rPr>
-        <w:t>Chat, what's the difference between this model and the centered one, and where have I seen this "offset then scale" trick before?</w:t>
+        <w:t>Chat, what's the difference between this model and the centered one?</w:t>
       </w:r>
     </w:p>
     <w:p>
       <w:pPr>
+        <w:spacing w:after="160"/>
+        <w:jc w:val="both"/>
         <w:bidi/>
-        <w:spacing w:after="160" w:before="0"/>
-        <w:jc w:val="both"/>
       </w:pPr>
       <w:r>
         <w:rPr>
           <w:rFonts w:ascii="David" w:hAnsi="David" w:cs="David" w:eastAsia="David"/>
           <w:b w:val="0"/>
-          <w:i w:val="0"/>
           <w:sz w:val="25"/>
           <w:rtl/>
         </w:rPr>
-        <w:t>והוא ענה שבמקום להצהיר על השיפוע של כל יום ישירות כנשלף מהתפלגות משותפת, מצהירים על משתנה סטנדרטי בסקאלה קבועה, ובונים את השיפוע בפועל כפעולה דטרמיניסטית: ממוצע משותף, ועוד המשתנה הסטנדרטי כפול סטיית התקן המשותפת. זו בדיוק אותה טריקה שמשמשת ב-Variational Autoencoders בלמידה עמוקה, אותה אלגברה בדיוק, רק ששם המטרה היא לאפשר גרדיאנטים לזרום דרך פעולת דגימה, וכאן המטרה היא לפשט את הגיאומטריה שהאלגוריתם צריך לחקור.</w:t>
+        <w:t>והוא ענה שבמקום להצהיר על השיפוע של כל יום ישירות כנשלף מהתפלגות משותפת, מצהירים על משתנה סטנדרטי בסקאלה קבועה, ובונים את השיפוע בפועל כפעולה דטרמיניסטית: ממוצע משותף, ועוד המשתנה הסטנדרטי כפול סטיית התקן המשותפת. זה בעצם מנתק את הגיאומטריה שה-NUTS צריך לחקור: למשתנה הסטנדרטי יש פוסטריורי קבוע ומתנהג יפה בסקאלת יחידה, בלי קשר לכמה קטנה סטיית התקן המשותפת נעשית, והגיאומטריה הבעייתית של המשפך עוברת לתוך כפל דטרמיניסטי פשוט במקום להישאר בתוך הפרמטר הנדגם עצמו.</w:t>
       </w:r>
     </w:p>
     <w:p>
       <w:pPr>
+        <w:spacing w:before="360" w:after="160"/>
+        <w:jc w:val="right"/>
         <w:bidi/>
-        <w:spacing w:after="160" w:before="360"/>
-        <w:jc w:val="right"/>
       </w:pPr>
       <w:r>
         <w:rPr>
           <w:rFonts w:ascii="David" w:hAnsi="David" w:cs="David" w:eastAsia="David"/>
           <w:b/>
-          <w:i w:val="0"/>
           <w:sz w:val="29"/>
           <w:rtl/>
         </w:rPr>
-        <w:t>כיווץ בשלוש רמות</w:t>
+        <w:t>כיווץ: רגרסיה נפרדת מול בייסאני היררכי</w:t>
       </w:r>
     </w:p>
     <w:p>
       <w:pPr>
+        <w:spacing w:after="160"/>
+        <w:jc w:val="both"/>
         <w:bidi/>
-        <w:spacing w:after="160" w:before="0"/>
-        <w:jc w:val="both"/>
       </w:pPr>
       <w:r>
         <w:rPr>
           <w:rFonts w:ascii="David" w:hAnsi="David" w:cs="David" w:eastAsia="David"/>
           <w:b w:val="0"/>
-          <w:i w:val="0"/>
           <w:sz w:val="25"/>
           <w:rtl/>
         </w:rPr>
-        <w:t>עכשיו לבדוק את הכיווץ משלוש זוויות בבת אחת. השאלה האחרונה היא אם משווים שיפוע נפרד לכל יום, בלי שום שיתוף מידע ביניהם, מול האומדן של מודל האפקטים המעורבים, מול הממוצע הפוסטריורי הבייסאני, האם שלושתם מסכימים על אילו ימים נמשכים הכי חזק לכיוון הממוצע. שאלתי את הצ'אט את זה במפורש:</w:t>
+        <w:t>עכשיו לבדוק את הכיווץ. השאלה היא אם משווים שיפוע נפרד לכל יום, שמותאם ב-OLS בלי שום שיתוף מידע בין הימים, מול הממוצע הפוסטריורי הבייסאני, שכן משתף מידע בין הימים דרך הפריור-העל, לאיזה כיוון ובאיזו עוצמה זז כל יום, ומה מסביר את זה. שאלתי את הצ'אט את זה במפורש:</w:t>
       </w:r>
     </w:p>
     <w:p>
       <w:pPr>
-        <w:spacing w:after="160" w:before="80"/>
+        <w:spacing w:before="80" w:after="160"/>
         <w:jc w:val="left"/>
         <w:shd w:val="clear" w:fill="EEF3FB"/>
       </w:pPr>
@@ -1243,57 +978,84 @@
         <w:rPr>
           <w:rFonts w:ascii="Segoe UI" w:hAnsi="Segoe UI" w:cs="Segoe UI" w:eastAsia="Segoe UI"/>
           <w:b/>
-          <w:i w:val="0"/>
           <w:sz w:val="24"/>
         </w:rPr>
-        <w:t>Chat, compare the day-level slope estimates from: (a) fitting each day completely separately with its own OLS, (b) MixedLM's random-effect (BLUP) adjustment, and (c) the Bayesian hierarchical posterior mean. Do they agree on which days get pulled the most?</w:t>
+        <w:t>Chat, compare the day-level slope estimates from: (a) fitting each day completely separately with its own OLS, and (b) the Bayesian hierarchical posterior mean. Which days move the most, and why?</w:t>
       </w:r>
     </w:p>
     <w:p>
       <w:pPr>
+        <w:spacing w:after="160"/>
+        <w:jc w:val="both"/>
         <w:bidi/>
-        <w:spacing w:after="160" w:before="0"/>
-        <w:jc w:val="both"/>
       </w:pPr>
       <w:r>
         <w:rPr>
           <w:rFonts w:ascii="David" w:hAnsi="David" w:cs="David" w:eastAsia="David"/>
           <w:b w:val="0"/>
-          <w:i w:val="0"/>
           <w:sz w:val="25"/>
           <w:rtl/>
         </w:rPr>
-        <w:t>הצ'אט לא ענה במילים הפעם, אלא הציע קוד שבונה טבלת השוואה בין שלושת השיפועים לכל יום, ביחד עם גרף שממחיש אותה. כשהרצתי את זה, אכן יצא ששלושת השיטות מסכימות על הכיוון: יום שישי, הקבוצה הכי קטנה, זז הכי הרבה מהאומדן הנפרד לכיוון הממוצע המשותף גם ב-BLUP של MixedLM וגם בממוצע הפוסטריורי הבייסאני, כי שתי השיטות מיישמות את אותו רעיון של איחוד חלקי, פשוט דרך מנגנון סטטיסטי שונה: אחת ממקסמת נראות והשנייה דוגמת פוסטריורי.</w:t>
+        <w:t>הצ'אט לא ענה במילים הפעם, אלא הציע קוד שבונה טבלת השוואה בין שני השיפועים לכל יום, ביחד עם גרף שממחיש אותה. כשהרצתי את זה, התוצאה לא הייתה זו שציפיתי לה: יום ראשון, לא יום שישי, זז הכי הרבה, מכ-0.070 לכ-0.079. יום שישי, שהוא דווקא הקבוצה הכי קטנה עם רק תשע-עשרה תצפיות, זז הכי פחות מכל הימים, מכ-0.095 לכ-0.100 בלבד. שאלתי את הצ'אט למה זה קורה, לאור זה שציפיתי שדווקא הקבוצה הכי קטנה תיכווץ הכי הרבה:</w:t>
       </w:r>
     </w:p>
     <w:p>
       <w:pPr>
+        <w:spacing w:before="80" w:after="160"/>
+        <w:jc w:val="left"/>
+        <w:shd w:val="clear" w:fill="EEF3FB"/>
+      </w:pPr>
+      <w:r>
+        <w:rPr>
+          <w:rFonts w:ascii="Segoe UI" w:hAnsi="Segoe UI" w:cs="Segoe UI" w:eastAsia="Segoe UI"/>
+          <w:b/>
+          <w:sz w:val="24"/>
+        </w:rPr>
+        <w:t>Chat, why does Sunday shrink the most here instead of Friday, the smallest group?</w:t>
+      </w:r>
+    </w:p>
+    <w:p>
+      <w:pPr>
+        <w:spacing w:after="160"/>
+        <w:jc w:val="both"/>
         <w:bidi/>
-        <w:spacing w:after="160" w:before="0"/>
-        <w:jc w:val="both"/>
       </w:pPr>
       <w:r>
         <w:rPr>
           <w:rFonts w:ascii="David" w:hAnsi="David" w:cs="David" w:eastAsia="David"/>
           <w:b w:val="0"/>
-          <w:i w:val="0"/>
           <w:sz w:val="25"/>
           <w:rtl/>
         </w:rPr>
-        <w:t>הגרף כאן, עם שלושה טורים, ללא שיתוף, אפקטים מעורבים, ובייסאני, וקו לכל יום שמחבר בין שלוש הנקודות שלו בכל טור, מאמת את זה חזותית: יום שישי אכן זז הכי הרבה משני הטורים האחרים לכיוון הממוצע המשותף, בשתי השיטות. זה בדיוק אימות מספרי לטענה שמודל אפקטים מעורבים הוא המקבילה הקלאסית לכיווץ בייסאני, לא רק אנלוגיה מילולית שנטענת בלי בדיקה.</w:t>
+        <w:t>והוא ענה שהכיווץ מושך כל יום לכיוון הדפוס המשותף של ארבעת הימים ביחד, וכמה כל יום זז בפועל תלוי קודם כול במרחק ההתחלתי של האומדן הנפרד שלו מהדפוס הזה, לא רק בגודל המדגם שלו. האומדן הנפרד של יום ראשון יצא נמוך במיוחד ביחס לשלושת הימים האחרים, ולכן דווקא הוא נמשך הכי הרבה, למרות שיש לו שבעים ושש תצפיות, הרבה יותר מיום שישי. האומדן הנפרד של יום שישי, לעומת זאת, יצא כבר קרוב למדי לדפוס המשותף מלכתחילה, כך שלמודל אין הרבה מה לתקן שם, גם אם התאוריה אומרת שקבוצה כל כך קטנה אמורה להיות הרגישה ביותר לכיווץ. גודל מדגם קטן קובע כמה חזק המודל *יכול* למשוך קבוצה לכיוון הממוצע, אבל לא בהכרח כמה הוא בסוף *בפועל* מזיז אותה.</w:t>
       </w:r>
     </w:p>
     <w:p>
       <w:pPr>
+        <w:spacing w:after="160"/>
+        <w:jc w:val="both"/>
         <w:bidi/>
-        <w:spacing w:after="160" w:before="360"/>
+      </w:pPr>
+      <w:r>
+        <w:rPr>
+          <w:rFonts w:ascii="David" w:hAnsi="David" w:cs="David" w:eastAsia="David"/>
+          <w:b w:val="0"/>
+          <w:sz w:val="25"/>
+          <w:rtl/>
+        </w:rPr>
+        <w:t>הגרף כאן, עם שני טורים, ללא שיתוף ובייסאני, וקו לכל יום שמחבר בין שתי הנקודות שלו, מאמת את זה חזותית: הקו של יום ראשון הוא בעל השיפוע התלול ביותר בין שני הטורים, ואילו הקו של יום שישי כמעט אופקי.</w:t>
+      </w:r>
+    </w:p>
+    <w:p>
+      <w:pPr>
+        <w:spacing w:before="360" w:after="160"/>
         <w:jc w:val="right"/>
+        <w:bidi/>
       </w:pPr>
       <w:r>
         <w:rPr>
           <w:rFonts w:ascii="David" w:hAnsi="David" w:cs="David" w:eastAsia="David"/>
           <w:b/>
-          <w:i w:val="0"/>
           <w:sz w:val="29"/>
           <w:rtl/>
         </w:rPr>
@@ -1302,15 +1064,14 @@
     </w:p>
     <w:p>
       <w:pPr>
+        <w:spacing w:after="160"/>
+        <w:jc w:val="both"/>
         <w:bidi/>
-        <w:spacing w:after="160" w:before="0"/>
-        <w:jc w:val="both"/>
       </w:pPr>
       <w:r>
         <w:rPr>
           <w:rFonts w:ascii="David" w:hAnsi="David" w:cs="David" w:eastAsia="David"/>
           <w:b w:val="0"/>
-          <w:i w:val="0"/>
           <w:sz w:val="25"/>
           <w:rtl/>
         </w:rPr>
@@ -1319,15 +1080,14 @@
     </w:p>
     <w:p>
       <w:pPr>
+        <w:spacing w:after="160"/>
+        <w:jc w:val="both"/>
         <w:bidi/>
-        <w:spacing w:after="160" w:before="0"/>
-        <w:jc w:val="both"/>
       </w:pPr>
       <w:r>
         <w:rPr>
           <w:rFonts w:ascii="David" w:hAnsi="David" w:cs="David" w:eastAsia="David"/>
           <w:b w:val="0"/>
-          <w:i w:val="0"/>
           <w:sz w:val="25"/>
           <w:rtl/>
         </w:rPr>
@@ -1336,7 +1096,7 @@
     </w:p>
     <w:p>
       <w:pPr>
-        <w:spacing w:after="160" w:before="80"/>
+        <w:spacing w:before="80" w:after="160"/>
         <w:jc w:val="left"/>
         <w:shd w:val="clear" w:fill="EEF3FB"/>
       </w:pPr>
@@ -1344,7 +1104,6 @@
         <w:rPr>
           <w:rFonts w:ascii="Segoe UI" w:hAnsi="Segoe UI" w:cs="Segoe UI" w:eastAsia="Segoe UI"/>
           <w:b/>
-          <w:i w:val="0"/>
           <w:sz w:val="24"/>
         </w:rPr>
         <w:t>Chat, what do I need to check before running a t-test, and what's the non-parametric alternative?</w:t>
@@ -1352,15 +1111,14 @@
     </w:p>
     <w:p>
       <w:pPr>
+        <w:spacing w:after="160"/>
+        <w:jc w:val="both"/>
         <w:bidi/>
-        <w:spacing w:after="160" w:before="0"/>
-        <w:jc w:val="both"/>
       </w:pPr>
       <w:r>
         <w:rPr>
           <w:rFonts w:ascii="David" w:hAnsi="David" w:cs="David" w:eastAsia="David"/>
           <w:b w:val="0"/>
-          <w:i w:val="0"/>
           <w:sz w:val="25"/>
           <w:rtl/>
         </w:rPr>
@@ -1369,32 +1127,30 @@
     </w:p>
     <w:p>
       <w:pPr>
+        <w:spacing w:after="160"/>
+        <w:jc w:val="both"/>
         <w:bidi/>
-        <w:spacing w:after="160" w:before="0"/>
-        <w:jc w:val="both"/>
       </w:pPr>
       <w:r>
         <w:rPr>
           <w:rFonts w:ascii="David" w:hAnsi="David" w:cs="David" w:eastAsia="David"/>
           <w:b w:val="0"/>
-          <w:i w:val="0"/>
           <w:sz w:val="25"/>
           <w:rtl/>
         </w:rPr>
-        <w:t>הרצתי את שני המבחנים על סכומי הטיפ בשבת ובשישי, ושניהם הגיעו לאותה מסקנה איכותית: אין הבדל מובהק בין שני הימים האלה בטיפ הגולמי. זה מרגיע, אבל זה לא תמיד יהיה כך, וההשוואה הרחבה יותר בהמשך היא בדיוק המקום שבו כבר ראינו את התשובה הפרמטרית והלא-פרמטרית נפרדות זו מזו.</w:t>
+        <w:t>הרצתי את שני המבחנים, עם ttest_ind ו-mannwhitneyu של scipy, על סכומי הטיפ בשבת ובשישי, ושניהם הגיעו לאותה מסקנה איכותית: אין הבדל מובהק בין שני הימים האלה בטיפ הגולמי. זה מרגיע, אבל זה לא תמיד יהיה כך, וההשוואה הרחבה יותר בהמשך היא בדיוק המקום שבו כבר ראינו את התשובה הפרמטרית והלא-פרמטרית נפרדות זו מזו.</w:t>
       </w:r>
     </w:p>
     <w:p>
       <w:pPr>
+        <w:spacing w:after="160"/>
+        <w:jc w:val="both"/>
         <w:bidi/>
-        <w:spacing w:after="160" w:before="0"/>
-        <w:jc w:val="both"/>
       </w:pPr>
       <w:r>
         <w:rPr>
           <w:rFonts w:ascii="David" w:hAnsi="David" w:cs="David" w:eastAsia="David"/>
           <w:b w:val="0"/>
-          <w:i w:val="0"/>
           <w:sz w:val="25"/>
           <w:rtl/>
         </w:rPr>
@@ -1403,7 +1159,7 @@
     </w:p>
     <w:p>
       <w:pPr>
-        <w:spacing w:after="160" w:before="80"/>
+        <w:spacing w:before="80" w:after="160"/>
         <w:jc w:val="left"/>
         <w:shd w:val="clear" w:fill="EEF3FB"/>
       </w:pPr>
@@ -1411,41 +1167,21 @@
         <w:rPr>
           <w:rFonts w:ascii="Segoe UI" w:hAnsi="Segoe UI" w:cs="Segoe UI" w:eastAsia="Segoe UI"/>
           <w:b/>
-          <w:i w:val="0"/>
           <w:sz w:val="24"/>
         </w:rPr>
-        <w:t xml:space="preserve">Chat, what's </w:t>
-      </w:r>
-      <w:r>
-        <w:rPr>
-          <w:rFonts w:ascii="Consolas" w:hAnsi="Consolas" w:cs="Consolas" w:eastAsia="Consolas"/>
-          <w:b/>
-          <w:i w:val="0"/>
-          <w:sz w:val="23"/>
-        </w:rPr>
-        <w:t>H0</w:t>
-      </w:r>
-      <w:r>
-        <w:rPr>
-          <w:rFonts w:ascii="Segoe UI" w:hAnsi="Segoe UI" w:cs="Segoe UI" w:eastAsia="Segoe UI"/>
-          <w:b/>
-          <w:i w:val="0"/>
-          <w:sz w:val="24"/>
-        </w:rPr>
-        <w:t xml:space="preserve"> of a one-way ANOVA, what are its assumptions, and why is it "just" an F-test?</w:t>
+        <w:t>Chat, what's `H0` of a one-way ANOVA, what are its assumptions, and why is it "just" an F-test?</w:t>
       </w:r>
     </w:p>
     <w:p>
       <w:pPr>
+        <w:spacing w:after="160"/>
+        <w:jc w:val="both"/>
         <w:bidi/>
-        <w:spacing w:after="160" w:before="0"/>
-        <w:jc w:val="both"/>
       </w:pPr>
       <w:r>
         <w:rPr>
           <w:rFonts w:ascii="David" w:hAnsi="David" w:cs="David" w:eastAsia="David"/>
           <w:b w:val="0"/>
-          <w:i w:val="0"/>
           <w:sz w:val="25"/>
           <w:rtl/>
         </w:rPr>
@@ -1454,24 +1190,23 @@
     </w:p>
     <w:p>
       <w:pPr>
+        <w:spacing w:after="160"/>
+        <w:jc w:val="both"/>
         <w:bidi/>
-        <w:spacing w:after="160" w:before="0"/>
-        <w:jc w:val="both"/>
       </w:pPr>
       <w:r>
         <w:rPr>
           <w:rFonts w:ascii="David" w:hAnsi="David" w:cs="David" w:eastAsia="David"/>
           <w:b w:val="0"/>
-          <w:i w:val="0"/>
           <w:sz w:val="25"/>
           <w:rtl/>
         </w:rPr>
-        <w:t>הרצתי את מבחן בארטלט על סכומי הטיפ בארבעת הימים, ותוצאתו הייתה מובהקת: השונויות באמת לא שוות: יום שבת מפוזר משמעותית יותר מיום שישי. זו בדיוק ההנחה ש-ANOVA נשען עליה, וכאן היא מופרת לא רק בתיאוריה אלא בנתונים עצמם. הרצתי בכל זאת את ה-ANOVA עצמו, ויצא לא מובהק. שאלתי את הצ'אט מתי בכלל עדיף להעדיף את המבחן הלא-פרמטרי המקביל:</w:t>
+        <w:t>הרצתי את מבחן בארטלט, עם bartlett של scipy, על סכומי הטיפ בארבעת הימים, ותוצאתו הייתה מובהקת: השונויות באמת לא שוות: יום שבת מפוזר משמעותית יותר מיום שישי. זו בדיוק ההנחה ש-ANOVA נשען עליה, וכאן היא מופרת לא רק בתיאוריה אלא בנתונים עצמם. הרצתי בכל זאת את ה-ANOVA עצמו, עם f_oneway, ויצא לא מובהק. שאלתי את הצ'אט מתי בכלל עדיף להעדיף את המבחן הלא-פרמטרי המקביל:</w:t>
       </w:r>
     </w:p>
     <w:p>
       <w:pPr>
-        <w:spacing w:after="160" w:before="80"/>
+        <w:spacing w:before="80" w:after="160"/>
         <w:jc w:val="left"/>
         <w:shd w:val="clear" w:fill="EEF3FB"/>
       </w:pPr>
@@ -1479,7 +1214,6 @@
         <w:rPr>
           <w:rFonts w:ascii="Segoe UI" w:hAnsi="Segoe UI" w:cs="Segoe UI" w:eastAsia="Segoe UI"/>
           <w:b/>
-          <w:i w:val="0"/>
           <w:sz w:val="24"/>
         </w:rPr>
         <w:t>Chat, when should I prefer Kruskal-Wallis over ANOVA, and does it matter here?</w:t>
@@ -1487,66 +1221,62 @@
     </w:p>
     <w:p>
       <w:pPr>
+        <w:spacing w:after="160"/>
+        <w:jc w:val="both"/>
         <w:bidi/>
-        <w:spacing w:after="160" w:before="0"/>
-        <w:jc w:val="both"/>
       </w:pPr>
       <w:r>
         <w:rPr>
           <w:rFonts w:ascii="David" w:hAnsi="David" w:cs="David" w:eastAsia="David"/>
           <w:b w:val="0"/>
-          <w:i w:val="0"/>
           <w:sz w:val="25"/>
           <w:rtl/>
         </w:rPr>
-        <w:t>והוא ענה שקרוסקל-וואליס בודק אם המדגמים מגיעים מאותה התפלגות באמצעות הדירוגים בלבד של הנתונים המאוחדים, ולא הערכים הגולמיים, ולכן הוא לא דורש נורמליות והרבה פחות רגיש להפרת שוויון השונויות. זה הגיבוי הטבעי בדיוק כשההנחות של ANOVA נראות רופפות, כמו שראינו במבחן בארטלט. וכן, זה משנה כאן בפועל: ANOVA חוזר לא מובהק, בעוד קרוסקל-וואליס על אותם נתונים בדיוק חוזר מובהק.</w:t>
+        <w:t>והוא ענה שקרוסקל-וואליס בודק אם המדגמים מגיעים מאותה התפלגות באמצעות הדירוגים בלבד של הנתונים המאוחדים, ולא הערכים הגולמיים, ולכן הוא לא דורש נורמליות והרבה פחות רגיש להפרת שוויון השונויות. זה הגיבוי הטבעי בדיוק כשההנחות של ANOVA נראות רופפות, כמו שראינו במבחן בארטלט.</w:t>
       </w:r>
     </w:p>
     <w:p>
       <w:pPr>
+        <w:spacing w:after="160"/>
+        <w:jc w:val="both"/>
         <w:bidi/>
-        <w:spacing w:after="160" w:before="0"/>
-        <w:jc w:val="both"/>
       </w:pPr>
       <w:r>
         <w:rPr>
           <w:rFonts w:ascii="David" w:hAnsi="David" w:cs="David" w:eastAsia="David"/>
           <w:b w:val="0"/>
-          <w:i w:val="0"/>
           <w:sz w:val="25"/>
           <w:rtl/>
         </w:rPr>
-        <w:t>אי ההתאמה הזו בין שני המבחנים חשובה, ולא כדאי סתם לבחור את המספר הנוח. מכיוון שמבחן בארטלט כבר אמר לנו שההנחה של ה-ANOVA עצמו מופרת, התשובה האמינה יותר כאן היא זו של קרוסקל-וואליס: על סכום הטיפ הגולמי, ארבעת הימים כנראה כן שונים במידה מסוימת, רק לא בצורה שמבחן רגיש-לשונות עם הנחה שלא מתקיימת יכול לזהות באמינות. זו סיבה אמיתית וניתנת לבדיקה להעדיף את המסקנה של מבחן אחד על פני אחר, על אותם נתונים בדיוק, לא רק הסתייגות תיאורטית.</w:t>
+        <w:t>וכן, זה משנה כאן בפועל: ANOVA חוזר לא מובהק, בעוד קרוסקל-וואליס על אותם נתונים בדיוק חוזר מובהק. אי ההתאמה הזו בין שני המבחנים חשובה, ולא כדאי סתם לבחור את המספר הנוח. מכיוון שמבחן בארטלט כבר אמר לנו שההנחה של ה-ANOVA עצמו מופרת, התשובה האמינה יותר כאן היא זו של קרוסקל-וואליס: על סכום הטיפ הגולמי, ארבעת הימים כנראה כן שונים במידה מסוימת, רק לא בצורה שמבחן רגיש-לשונות עם הנחה שלא מתקיימת יכול לזהות באמינות. זו סיבה אמיתית וניתנת לבדיקה להעדיף את המסקנה של מבחן אחד על פני אחר, על אותם נתונים בדיוק, לא רק הסתייגות תיאורטית.</w:t>
       </w:r>
     </w:p>
     <w:p>
       <w:pPr>
+        <w:spacing w:after="160"/>
+        <w:jc w:val="both"/>
         <w:bidi/>
-        <w:spacing w:after="160" w:before="0"/>
-        <w:jc w:val="both"/>
       </w:pPr>
       <w:r>
         <w:rPr>
           <w:rFonts w:ascii="David" w:hAnsi="David" w:cs="David" w:eastAsia="David"/>
           <w:b w:val="0"/>
-          <w:i w:val="0"/>
           <w:sz w:val="25"/>
           <w:rtl/>
         </w:rPr>
-        <w:t>הצד הבייסאני של אותה שאלה פשוט יותר: מכיוון שהמודל ההיררכי כבר נותן לנו פוסטריורי מלא לכל אחד מפרמטרי הימים, אפשר לקרוא שאלת הבדל בין קבוצות ישירות מהם, בלי לבחור בין מבחנים מתחרים ובלי לדאוג לגבי איזה מהם עומד בהנחותיו. בדקתי את ההפרש בין השיפוע של חמישי לשיפוע של ראשון. לפני שממשיכים, הערה מתודולוגית שחשוב לומר בקול: בחרתי דווקא בזוג הזה כי הוא הראה את ההבדל הגדול ביותר בטבלת הסיכום, לא כי קבעתי מראש שאבדוק אותו. יש בזה סיכון אמיתי: אם בעצם "בדקנו בעין" את כל שישה הזוגות האפשריים בין ארבעת הימים ובחרנו להריץ מבחן פורמלי רק על הזוג שנראה הכי קיצוני, אז ערך מובהקות בודד על הזוג הזה מזלזל בסיכוי שפער כזה יצוץ במקרה איפשהו מתוך כל הזוגות. התיקון הקלאסי הסטנדרטי למצב כזה נקרא תיקון להשוואות מרובות, וכולל שיטות כמו תיקון בונפרוני או שיטת בנג'מיני-הוכברג הפחות שמרנית, שמיושמות על כל הזוגות שבאמת נבדקו. שווה לקרוא לזה בשמו במפורש במקום לדווח בשקט ערך מובהקות אחד מחמיא כאילו נקבע מראש. רווח האמון של 95 אחוז על ההפרש יוצא בקושי חיובי לגמרי, כמעט נוגע באפס בקצה התחתון שלו, וההסתברות הפוסטריורית ששיפוע חמישי גדול משיפוע ראשון יוצאת קרוב לתשעים ושמונה אחוז: עדות אמיתית וסבירה, אבל לא מוחלטת, לא ברמת הביטחון שראינו כשהשווינו שני מחוזות בית ספר שונים מאוד במחברת הקודמת. זו בדיוק הרמת ביטחון הנכונה לדווח עליה: יש כאן הבדל אמיתי בקשר בין חשבון לטיפ בין שני הימים האלה, רק לא הבדל מוחץ. תמונה מכוילת יותר ממה שתווית "מובהק / לא מובהק" בודדת הייתה נותנת.</w:t>
+        <w:t>לשאלה המקורית, לא הפשוטה, יש כבר תשובה בייסאנית מוכנה בלי מודל נוסף: מהפוסטריורי המלא של השיפוע לכל יום, שכבר בנינו, אפשר לקרוא הבדל בין שתי קבוצות ישירות מההפרש ביניהן, בלי לבחור בין מבחנים מתחרים ובלי לדאוג איזה מהם עומד בהנחותיו. בדקתי עם az.hdi את ההפרש בין שיפוע חמישי לשיפוע ראשון, הזוג עם ההבדל הגדול ביותר בטבלת הסיכום. רווח האמון של 95 אחוז יוצא בקושי חיובי לגמרי, וההסתברות הפוסטריורית ששיפוע חמישי גדול משיפוע ראשון קרובה לתשעים ושמונה אחוז: עדות אמיתית וסבירה, אבל לא מוחלטת. יש כאן הבדל אמיתי בקשר חשבון-טיפ בין שני הימים האלה, רק לא הבדל מוחץ.</w:t>
       </w:r>
     </w:p>
     <w:p>
       <w:pPr>
+        <w:spacing w:before="360" w:after="160"/>
+        <w:jc w:val="right"/>
         <w:bidi/>
-        <w:spacing w:after="160" w:before="360"/>
-        <w:jc w:val="right"/>
       </w:pPr>
       <w:r>
         <w:rPr>
           <w:rFonts w:ascii="David" w:hAnsi="David" w:cs="David" w:eastAsia="David"/>
           <w:b/>
-          <w:i w:val="0"/>
           <w:sz w:val="29"/>
           <w:rtl/>
         </w:rPr>
@@ -1555,24 +1285,23 @@
     </w:p>
     <w:p>
       <w:pPr>
+        <w:spacing w:after="160"/>
+        <w:jc w:val="both"/>
         <w:bidi/>
-        <w:spacing w:after="160" w:before="0"/>
-        <w:jc w:val="both"/>
       </w:pPr>
       <w:r>
         <w:rPr>
           <w:rFonts w:ascii="David" w:hAnsi="David" w:cs="David" w:eastAsia="David"/>
           <w:b w:val="0"/>
-          <w:i w:val="0"/>
           <w:sz w:val="25"/>
           <w:rtl/>
         </w:rPr>
-        <w:t>לסיכום הכול: ברגרסיה הבסיסית, OLS ובייסאני יצאו כמעט זהים במספרים; בתחזית, אותה צורה איכותית של רצועות; בהיררכיה, שני המודלים הקלאסי והבייסאני מכווצים קבוצות קטנות באופן דומה מאוד; ובשאלת ההבדל בין ימים, ANOVA וקרוסקל-וואליס נתנו תשובות סותרות שנפתרו בעזרת בדיקת הנחה, בעוד הפוסטריורי הבייסאני נתן ישר תשובה מכוילת בלי הצורך לבחור מבחן מראש. ורק במודל הבייסאני, ולא בקלאסי המקביל לו, הייתה בכלל בעיית דגימה כמו הדיברגנסים, וגם הפתרון שלה.</w:t>
+        <w:t>לאורך המחברת הזו השווינו גישה בייסאנית מול גישה קלאסית על אותה שאלה בדיוק: האם סכום החשבון מנבא את גובה הטיפ, והאם הקשר הזה שונה בין ימים. שלושה ממצאים עיקריים עולים מזה. ברגרסיה הבסיסית, OLS והבייסאני יצאו כמעט זהים, וההבדל האמיתי בין הגישות לא היה בתשובה עצמה אלא בכלים הנוספים שהפוסטריורי המלא מאפשר, כמו רצועות אי-ודאות. במודל ההיררכי ראינו שכיווץ לא בהכרח פוגע הכי חזק בקבוצה הקטנה ביותר, אלא בקבוצה שהאומדן הנפרד שלה התחיל הכי רחוק מהדפוס המשותף. ובשאלת ההבדל בין ימים, ANOVA וקרוסקל-וואליס נתנו תשובות סותרות זו לזו, בעוד שהגישה הבייסאנית נתנה תשובה ישירה בלי צורך לבחור מבחן מראש. שווה גם לזכור: רק במודל הבייסאני, שדוגם מהפוסטריורי, הייתה בכלל בעיית דגימה כמו משפך Neal, וגם מצאנו לה פתרון.</w:t>
       </w:r>
     </w:p>
     <w:sectPr>
       <w:pgSz w:w="12240" w:h="15840"/>
-      <w:pgMar w:top="1020" w:right="1134" w:bottom="1020" w:left="1134" w:header="720" w:footer="720" w:gutter="0"/>
+      <w:pgMar w:top="1022" w:right="1138" w:bottom="1022" w:left="1138" w:header="720" w:footer="720" w:gutter="0"/>
       <w:cols w:space="720"/>
       <w:docGrid w:linePitch="360"/>
     </w:sectPr>
@@ -1943,10 +1672,6 @@
     <w:name w:val="Normal"/>
     <w:qFormat/>
     <w:rsid w:val="00FC693F"/>
-    <w:rPr>
-      <w:rFonts w:ascii="David" w:hAnsi="David"/>
-      <w:sz w:val="25"/>
-    </w:rPr>
   </w:style>
   <w:style w:type="paragraph" w:styleId="Header">
     <w:name w:val="header"/>

</xml_diff>